<commit_message>
updated configuration pfsense, added cyberlab image
</commit_message>
<xml_diff>
--- a/docs/3-Guide-Configuration-pfSense.docx
+++ b/docs/3-Guide-Configuration-pfSense.docx
@@ -18,7 +18,7 @@
         </w:rPr>
       </w:r>
     </w:p>
-    <w:bookmarkStart w:colFirst="0" w:colLast="0" w:name="fmsplsxk9u95" w:id="0"/>
+    <w:bookmarkStart w:colFirst="0" w:colLast="0" w:name="3aafnzez3dxr" w:id="0"/>
     <w:bookmarkEnd w:id="0"/>
     <w:p>
       <w:pPr>
@@ -76,7 +76,7 @@
         </w:rPr>
       </w:r>
     </w:p>
-    <w:bookmarkStart w:colFirst="0" w:colLast="0" w:name="swuwlgarklz" w:id="1"/>
+    <w:bookmarkStart w:colFirst="0" w:colLast="0" w:name="z6l58zlev6hl" w:id="1"/>
     <w:bookmarkEnd w:id="1"/>
     <w:p>
       <w:pPr>
@@ -104,12 +104,12 @@
       <w:pPr>
         <w:numPr>
           <w:ilvl w:val="0"/>
-          <w:numId w:val="4"/>
+          <w:numId w:val="10"/>
         </w:numPr>
         <w:ind w:left="720" w:hanging="360"/>
         <w:rPr/>
       </w:pPr>
-      <w:hyperlink w:anchor="n29dgp6094aa">
+      <w:hyperlink w:anchor="d14ukxa3hysd">
         <w:r>
           <w:rPr>
             <w:color w:val="4472c4"/>
@@ -128,12 +128,12 @@
       <w:pPr>
         <w:numPr>
           <w:ilvl w:val="0"/>
-          <w:numId w:val="4"/>
+          <w:numId w:val="10"/>
         </w:numPr>
         <w:ind w:left="720" w:hanging="360"/>
         <w:rPr/>
       </w:pPr>
-      <w:hyperlink w:anchor="1oystmheqp41">
+      <w:hyperlink w:anchor="38m7gscw18v">
         <w:r>
           <w:rPr>
             <w:color w:val="4472c4"/>
@@ -152,12 +152,12 @@
       <w:pPr>
         <w:numPr>
           <w:ilvl w:val="0"/>
-          <w:numId w:val="4"/>
+          <w:numId w:val="10"/>
         </w:numPr>
         <w:ind w:left="720" w:hanging="360"/>
         <w:rPr/>
       </w:pPr>
-      <w:hyperlink w:anchor="f746xcp07ica">
+      <w:hyperlink w:anchor="xwdh379qsqxi">
         <w:r>
           <w:rPr>
             <w:color w:val="4472c4"/>
@@ -176,12 +176,12 @@
       <w:pPr>
         <w:numPr>
           <w:ilvl w:val="0"/>
-          <w:numId w:val="4"/>
+          <w:numId w:val="10"/>
         </w:numPr>
         <w:ind w:left="720" w:hanging="360"/>
         <w:rPr/>
       </w:pPr>
-      <w:hyperlink w:anchor="85wpdstmwlx0">
+      <w:hyperlink w:anchor="a35b14csynkj">
         <w:r>
           <w:rPr>
             <w:color w:val="4472c4"/>
@@ -200,12 +200,12 @@
       <w:pPr>
         <w:numPr>
           <w:ilvl w:val="0"/>
-          <w:numId w:val="4"/>
+          <w:numId w:val="10"/>
         </w:numPr>
         <w:ind w:left="720" w:hanging="360"/>
         <w:rPr/>
       </w:pPr>
-      <w:hyperlink w:anchor="q9klj7wz2i26">
+      <w:hyperlink w:anchor="i9fen1baoyf7">
         <w:r>
           <w:rPr>
             <w:rFonts w:ascii="Georgia" w:cs="Georgia" w:eastAsia="Georgia" w:hAnsi="Georgia"/>
@@ -225,12 +225,12 @@
       <w:pPr>
         <w:numPr>
           <w:ilvl w:val="0"/>
-          <w:numId w:val="4"/>
+          <w:numId w:val="10"/>
         </w:numPr>
         <w:ind w:left="720" w:hanging="360"/>
         <w:rPr/>
       </w:pPr>
-      <w:hyperlink w:anchor="59x9fhp5ldst">
+      <w:hyperlink w:anchor="ed0kmet50ai6">
         <w:r>
           <w:rPr>
             <w:color w:val="4472c4"/>
@@ -249,12 +249,12 @@
       <w:pPr>
         <w:numPr>
           <w:ilvl w:val="0"/>
-          <w:numId w:val="4"/>
+          <w:numId w:val="10"/>
         </w:numPr>
         <w:ind w:left="720" w:hanging="360"/>
         <w:rPr/>
       </w:pPr>
-      <w:hyperlink w:anchor="fdcfcbp03mwy">
+      <w:hyperlink w:anchor="53i132x1sfm0">
         <w:r>
           <w:rPr>
             <w:color w:val="4472c4"/>
@@ -273,12 +273,12 @@
       <w:pPr>
         <w:numPr>
           <w:ilvl w:val="0"/>
-          <w:numId w:val="4"/>
+          <w:numId w:val="10"/>
         </w:numPr>
         <w:ind w:left="720" w:hanging="360"/>
         <w:rPr/>
       </w:pPr>
-      <w:hyperlink w:anchor="63yhol87wy0">
+      <w:hyperlink w:anchor="9netncdcc5l3">
         <w:r>
           <w:rPr>
             <w:color w:val="4472c4"/>
@@ -297,12 +297,12 @@
       <w:pPr>
         <w:numPr>
           <w:ilvl w:val="0"/>
-          <w:numId w:val="4"/>
+          <w:numId w:val="10"/>
         </w:numPr>
         <w:ind w:left="720" w:hanging="360"/>
         <w:rPr/>
       </w:pPr>
-      <w:hyperlink w:anchor="hx60llo3fx92">
+      <w:hyperlink w:anchor="1djpwer1hyu4">
         <w:r>
           <w:rPr>
             <w:color w:val="4472c4"/>
@@ -321,12 +321,12 @@
       <w:pPr>
         <w:numPr>
           <w:ilvl w:val="0"/>
-          <w:numId w:val="4"/>
+          <w:numId w:val="10"/>
         </w:numPr>
         <w:ind w:left="720" w:hanging="360"/>
         <w:rPr/>
       </w:pPr>
-      <w:hyperlink w:anchor="d3ylmc9ri42b">
+      <w:hyperlink w:anchor="t1bariunt8mf">
         <w:r>
           <w:rPr>
             <w:color w:val="4472c4"/>
@@ -345,12 +345,12 @@
       <w:pPr>
         <w:numPr>
           <w:ilvl w:val="0"/>
-          <w:numId w:val="4"/>
+          <w:numId w:val="10"/>
         </w:numPr>
         <w:ind w:left="720" w:hanging="360"/>
         <w:rPr/>
       </w:pPr>
-      <w:hyperlink w:anchor="mji96w9ygtsg">
+      <w:hyperlink w:anchor="1azur11ieh9z">
         <w:r>
           <w:rPr>
             <w:rFonts w:ascii="Georgia" w:cs="Georgia" w:eastAsia="Georgia" w:hAnsi="Georgia"/>
@@ -381,7 +381,7 @@
         </w:rPr>
       </w:r>
     </w:p>
-    <w:bookmarkStart w:colFirst="0" w:colLast="0" w:name="xt5xvdv0psbp" w:id="2"/>
+    <w:bookmarkStart w:colFirst="0" w:colLast="0" w:name="n6t2rx94wxut" w:id="2"/>
     <w:bookmarkEnd w:id="2"/>
     <w:p>
       <w:pPr>
@@ -405,7 +405,7 @@
         </w:rPr>
       </w:r>
     </w:p>
-    <w:bookmarkStart w:colFirst="0" w:colLast="0" w:name="a728ed6almqu" w:id="3"/>
+    <w:bookmarkStart w:colFirst="0" w:colLast="0" w:name="ecc3yy2mudcr" w:id="3"/>
     <w:bookmarkEnd w:id="3"/>
     <w:p>
       <w:pPr>
@@ -603,7 +603,7 @@
         </w:rPr>
       </w:r>
     </w:p>
-    <w:bookmarkStart w:colFirst="0" w:colLast="0" w:name="kpxtkseikzsl" w:id="4"/>
+    <w:bookmarkStart w:colFirst="0" w:colLast="0" w:name="hu8dvie7yscz" w:id="4"/>
     <w:bookmarkEnd w:id="4"/>
     <w:p>
       <w:pPr>
@@ -627,7 +627,7 @@
         </w:rPr>
       </w:r>
     </w:p>
-    <w:bookmarkStart w:colFirst="0" w:colLast="0" w:name="jx3iv8mkcq51" w:id="5"/>
+    <w:bookmarkStart w:colFirst="0" w:colLast="0" w:name="vtnzmzvhfewr" w:id="5"/>
     <w:bookmarkEnd w:id="5"/>
     <w:p>
       <w:pPr>
@@ -655,7 +655,7 @@
       <w:pPr>
         <w:numPr>
           <w:ilvl w:val="0"/>
-          <w:numId w:val="8"/>
+          <w:numId w:val="14"/>
         </w:numPr>
         <w:ind w:left="720" w:hanging="360"/>
         <w:rPr/>
@@ -695,7 +695,7 @@
       <w:pPr>
         <w:numPr>
           <w:ilvl w:val="0"/>
-          <w:numId w:val="8"/>
+          <w:numId w:val="14"/>
         </w:numPr>
         <w:ind w:left="720" w:hanging="360"/>
         <w:rPr/>
@@ -725,7 +725,7 @@
       <w:pPr>
         <w:numPr>
           <w:ilvl w:val="0"/>
-          <w:numId w:val="8"/>
+          <w:numId w:val="14"/>
         </w:numPr>
         <w:ind w:left="720" w:hanging="360"/>
         <w:rPr/>
@@ -751,7 +751,7 @@
         </w:rPr>
       </w:r>
     </w:p>
-    <w:bookmarkStart w:colFirst="0" w:colLast="0" w:name="4o5a62gyl1dz" w:id="6"/>
+    <w:bookmarkStart w:colFirst="0" w:colLast="0" w:name="x1db229oggkr" w:id="6"/>
     <w:bookmarkEnd w:id="6"/>
     <w:p>
       <w:pPr>
@@ -779,7 +779,7 @@
       <w:pPr>
         <w:numPr>
           <w:ilvl w:val="0"/>
-          <w:numId w:val="9"/>
+          <w:numId w:val="15"/>
         </w:numPr>
         <w:ind w:left="720" w:hanging="360"/>
         <w:rPr/>
@@ -820,7 +820,7 @@
       <w:pPr>
         <w:numPr>
           <w:ilvl w:val="0"/>
-          <w:numId w:val="9"/>
+          <w:numId w:val="15"/>
         </w:numPr>
         <w:ind w:left="720" w:hanging="360"/>
         <w:rPr/>
@@ -850,7 +850,7 @@
       <w:pPr>
         <w:numPr>
           <w:ilvl w:val="0"/>
-          <w:numId w:val="9"/>
+          <w:numId w:val="15"/>
         </w:numPr>
         <w:ind w:left="720" w:hanging="360"/>
         <w:rPr/>
@@ -870,7 +870,7 @@
         <w:t xml:space="preserve"> Router-on-a-Stick, NAT vers Internet, filtrage inter-VLAN</w:t>
       </w:r>
     </w:p>
-    <w:bookmarkStart w:colFirst="0" w:colLast="0" w:name="mnlc5vkawunv" w:id="7"/>
+    <w:bookmarkStart w:colFirst="0" w:colLast="0" w:name="dyba7tuhpaxl" w:id="7"/>
     <w:bookmarkEnd w:id="7"/>
     <w:p>
       <w:pPr>
@@ -2192,7 +2192,7 @@
         </w:rPr>
       </w:r>
     </w:p>
-    <w:bookmarkStart w:colFirst="0" w:colLast="0" w:name="lrel2o3v7kj6" w:id="8"/>
+    <w:bookmarkStart w:colFirst="0" w:colLast="0" w:name="rif78pijo75c" w:id="8"/>
     <w:bookmarkEnd w:id="8"/>
     <w:p>
       <w:pPr>
@@ -2216,7 +2216,7 @@
         </w:rPr>
       </w:r>
     </w:p>
-    <w:bookmarkStart w:colFirst="0" w:colLast="0" w:name="cemkf7yiimwi" w:id="9"/>
+    <w:bookmarkStart w:colFirst="0" w:colLast="0" w:name="nokfjansz2ar" w:id="9"/>
     <w:bookmarkEnd w:id="9"/>
     <w:p>
       <w:pPr>
@@ -2268,7 +2268,7 @@
         <w:t xml:space="preserve"> sur l'interface LAN.</w:t>
       </w:r>
     </w:p>
-    <w:bookmarkStart w:colFirst="0" w:colLast="0" w:name="phsuknc9ieph" w:id="10"/>
+    <w:bookmarkStart w:colFirst="0" w:colLast="0" w:name="zhukdlrfa0dv" w:id="10"/>
     <w:bookmarkEnd w:id="10"/>
     <w:p>
       <w:pPr>
@@ -3118,7 +3118,7 @@
         <w:t xml:space="preserve">)</w:t>
       </w:r>
     </w:p>
-    <w:bookmarkStart w:colFirst="0" w:colLast="0" w:name="ffyaue1yifvh" w:id="11"/>
+    <w:bookmarkStart w:colFirst="0" w:colLast="0" w:name="5g35jnnqydrt" w:id="11"/>
     <w:bookmarkEnd w:id="11"/>
     <w:p>
       <w:pPr>
@@ -4244,7 +4244,7 @@
         </w:rPr>
       </w:r>
     </w:p>
-    <w:bookmarkStart w:colFirst="0" w:colLast="0" w:name="ekdhjitkss3i" w:id="12"/>
+    <w:bookmarkStart w:colFirst="0" w:colLast="0" w:name="kh9tj0ajhr23" w:id="12"/>
     <w:bookmarkEnd w:id="12"/>
     <w:p>
       <w:pPr>
@@ -4268,7 +4268,7 @@
         </w:rPr>
       </w:r>
     </w:p>
-    <w:bookmarkStart w:colFirst="0" w:colLast="0" w:name="vij0rjlme4v6" w:id="13"/>
+    <w:bookmarkStart w:colFirst="0" w:colLast="0" w:name="8vzpgxtxchye" w:id="13"/>
     <w:bookmarkEnd w:id="13"/>
     <w:p>
       <w:pPr>
@@ -4348,7 +4348,7 @@
       <w:pPr>
         <w:numPr>
           <w:ilvl w:val="0"/>
-          <w:numId w:val="10"/>
+          <w:numId w:val="2"/>
         </w:numPr>
         <w:ind w:left="720" w:hanging="360"/>
         <w:rPr/>
@@ -4385,7 +4385,7 @@
       <w:pPr>
         <w:numPr>
           <w:ilvl w:val="0"/>
-          <w:numId w:val="10"/>
+          <w:numId w:val="2"/>
         </w:numPr>
         <w:ind w:left="720" w:hanging="360"/>
         <w:rPr/>
@@ -4403,7 +4403,7 @@
         </w:rPr>
       </w:r>
     </w:p>
-    <w:bookmarkStart w:colFirst="0" w:colLast="0" w:name="5ocspyel20t1" w:id="14"/>
+    <w:bookmarkStart w:colFirst="0" w:colLast="0" w:name="f1jy3kapjhxu" w:id="14"/>
     <w:bookmarkEnd w:id="14"/>
     <w:p>
       <w:pPr>
@@ -4485,7 +4485,7 @@
       <w:pPr>
         <w:numPr>
           <w:ilvl w:val="0"/>
-          <w:numId w:val="11"/>
+          <w:numId w:val="3"/>
         </w:numPr>
         <w:ind w:left="720" w:hanging="360"/>
         <w:rPr/>
@@ -4541,7 +4541,7 @@
       <w:pPr>
         <w:numPr>
           <w:ilvl w:val="0"/>
-          <w:numId w:val="11"/>
+          <w:numId w:val="3"/>
         </w:numPr>
         <w:ind w:left="720" w:hanging="360"/>
         <w:rPr/>
@@ -4581,7 +4581,7 @@
       <w:pPr>
         <w:numPr>
           <w:ilvl w:val="0"/>
-          <w:numId w:val="11"/>
+          <w:numId w:val="3"/>
         </w:numPr>
         <w:ind w:left="720" w:hanging="360"/>
         <w:rPr/>
@@ -4666,7 +4666,7 @@
       <w:pPr>
         <w:numPr>
           <w:ilvl w:val="0"/>
-          <w:numId w:val="12"/>
+          <w:numId w:val="4"/>
         </w:numPr>
         <w:ind w:left="720" w:hanging="360"/>
         <w:rPr/>
@@ -4722,7 +4722,7 @@
       <w:pPr>
         <w:numPr>
           <w:ilvl w:val="0"/>
-          <w:numId w:val="12"/>
+          <w:numId w:val="4"/>
         </w:numPr>
         <w:ind w:left="720" w:hanging="360"/>
         <w:rPr/>
@@ -4762,7 +4762,7 @@
       <w:pPr>
         <w:numPr>
           <w:ilvl w:val="0"/>
-          <w:numId w:val="12"/>
+          <w:numId w:val="4"/>
         </w:numPr>
         <w:ind w:left="720" w:hanging="360"/>
         <w:rPr/>
@@ -4812,7 +4812,7 @@
         </w:rPr>
       </w:r>
     </w:p>
-    <w:bookmarkStart w:colFirst="0" w:colLast="0" w:name="hnq9mxv5mvld" w:id="15"/>
+    <w:bookmarkStart w:colFirst="0" w:colLast="0" w:name="crutdxynblk8" w:id="15"/>
     <w:bookmarkEnd w:id="15"/>
     <w:p>
       <w:pPr>
@@ -4836,7 +4836,7 @@
         </w:rPr>
       </w:r>
     </w:p>
-    <w:bookmarkStart w:colFirst="0" w:colLast="0" w:name="4v58a5km9txh" w:id="16"/>
+    <w:bookmarkStart w:colFirst="0" w:colLast="0" w:name="62joelll8vpe" w:id="16"/>
     <w:bookmarkEnd w:id="16"/>
     <w:p>
       <w:pPr>
@@ -4877,7 +4877,7 @@
         </w:rPr>
       </w:r>
     </w:p>
-    <w:bookmarkStart w:colFirst="0" w:colLast="0" w:name="dc2yzxhvueng" w:id="17"/>
+    <w:bookmarkStart w:colFirst="0" w:colLast="0" w:name="3g6m9weol3j1" w:id="17"/>
     <w:bookmarkEnd w:id="17"/>
     <w:p>
       <w:pPr>
@@ -6303,7 +6303,7 @@
         </w:rPr>
       </w:r>
     </w:p>
-    <w:bookmarkStart w:colFirst="0" w:colLast="0" w:name="s8g19rp716be" w:id="18"/>
+    <w:bookmarkStart w:colFirst="0" w:colLast="0" w:name="3aiq1lc20dzl" w:id="18"/>
     <w:bookmarkEnd w:id="18"/>
     <w:p>
       <w:pPr>
@@ -7046,7 +7046,7 @@
         </w:rPr>
       </w:r>
     </w:p>
-    <w:bookmarkStart w:colFirst="0" w:colLast="0" w:name="ulwpus994vl6" w:id="19"/>
+    <w:bookmarkStart w:colFirst="0" w:colLast="0" w:name="a8v15mdu07lc" w:id="19"/>
     <w:bookmarkEnd w:id="19"/>
     <w:p>
       <w:pPr>
@@ -8214,7 +8214,7 @@
         </w:rPr>
       </w:r>
     </w:p>
-    <w:bookmarkStart w:colFirst="0" w:colLast="0" w:name="nraiagsye61a" w:id="20"/>
+    <w:bookmarkStart w:colFirst="0" w:colLast="0" w:name="lv8jhlwx7qo4" w:id="20"/>
     <w:bookmarkEnd w:id="20"/>
     <w:p>
       <w:pPr>
@@ -9068,7 +9068,7 @@
         </w:rPr>
       </w:r>
     </w:p>
-    <w:bookmarkStart w:colFirst="0" w:colLast="0" w:name="mdikys30w46b" w:id="21"/>
+    <w:bookmarkStart w:colFirst="0" w:colLast="0" w:name="led9p8dsj0f5" w:id="21"/>
     <w:bookmarkEnd w:id="21"/>
     <w:p>
       <w:pPr>
@@ -10381,7 +10381,7 @@
         </w:rPr>
       </w:r>
     </w:p>
-    <w:bookmarkStart w:colFirst="0" w:colLast="0" w:name="vg9dmw8qrnse" w:id="22"/>
+    <w:bookmarkStart w:colFirst="0" w:colLast="0" w:name="fth66ee6bf2o" w:id="22"/>
     <w:bookmarkEnd w:id="22"/>
     <w:p>
       <w:pPr>
@@ -11245,7 +11245,7 @@
         </w:rPr>
       </w:r>
     </w:p>
-    <w:bookmarkStart w:colFirst="0" w:colLast="0" w:name="z877vumsq76x" w:id="23"/>
+    <w:bookmarkStart w:colFirst="0" w:colLast="0" w:name="wwe2m5wehkh2" w:id="23"/>
     <w:bookmarkEnd w:id="23"/>
     <w:p>
       <w:pPr>
@@ -11767,7 +11767,7 @@
         </w:rPr>
       </w:r>
     </w:p>
-    <w:bookmarkStart w:colFirst="0" w:colLast="0" w:name="toinphhjn5wc" w:id="24"/>
+    <w:bookmarkStart w:colFirst="0" w:colLast="0" w:name="hi63rfg15isa" w:id="24"/>
     <w:bookmarkEnd w:id="24"/>
     <w:p>
       <w:pPr>
@@ -12458,7 +12458,7 @@
         </w:rPr>
       </w:r>
     </w:p>
-    <w:bookmarkStart w:colFirst="0" w:colLast="0" w:name="d6lxs61xo8ew" w:id="25"/>
+    <w:bookmarkStart w:colFirst="0" w:colLast="0" w:name="va3qkez1pc13" w:id="25"/>
     <w:bookmarkEnd w:id="25"/>
     <w:p>
       <w:pPr>
@@ -12513,7 +12513,7 @@
       <w:pPr>
         <w:numPr>
           <w:ilvl w:val="0"/>
-          <w:numId w:val="13"/>
+          <w:numId w:val="5"/>
         </w:numPr>
         <w:ind w:left="720" w:hanging="360"/>
         <w:rPr/>
@@ -12550,7 +12550,7 @@
       <w:pPr>
         <w:numPr>
           <w:ilvl w:val="0"/>
-          <w:numId w:val="13"/>
+          <w:numId w:val="5"/>
         </w:numPr>
         <w:ind w:left="720" w:hanging="360"/>
         <w:rPr/>
@@ -12587,7 +12587,7 @@
       <w:pPr>
         <w:numPr>
           <w:ilvl w:val="0"/>
-          <w:numId w:val="13"/>
+          <w:numId w:val="5"/>
         </w:numPr>
         <w:ind w:left="720" w:hanging="360"/>
         <w:rPr/>
@@ -12624,7 +12624,7 @@
       <w:pPr>
         <w:numPr>
           <w:ilvl w:val="0"/>
-          <w:numId w:val="13"/>
+          <w:numId w:val="5"/>
         </w:numPr>
         <w:ind w:left="720" w:hanging="360"/>
         <w:rPr/>
@@ -12672,7 +12672,7 @@
         </w:rPr>
       </w:r>
     </w:p>
-    <w:bookmarkStart w:colFirst="0" w:colLast="0" w:name="opjtbggpzutq" w:id="26"/>
+    <w:bookmarkStart w:colFirst="0" w:colLast="0" w:name="gow6jlbxzs1s" w:id="26"/>
     <w:bookmarkEnd w:id="26"/>
     <w:p>
       <w:pPr>
@@ -12696,7 +12696,7 @@
         </w:rPr>
       </w:r>
     </w:p>
-    <w:bookmarkStart w:colFirst="0" w:colLast="0" w:name="nr7i39xd04hy" w:id="27"/>
+    <w:bookmarkStart w:colFirst="0" w:colLast="0" w:name="6vll36d5mq2j" w:id="27"/>
     <w:bookmarkEnd w:id="27"/>
     <w:p>
       <w:pPr>
@@ -12724,7 +12724,7 @@
       <w:pPr>
         <w:numPr>
           <w:ilvl w:val="0"/>
-          <w:numId w:val="14"/>
+          <w:numId w:val="6"/>
         </w:numPr>
         <w:ind w:left="720" w:hanging="360"/>
         <w:rPr/>
@@ -12748,7 +12748,7 @@
       <w:pPr>
         <w:numPr>
           <w:ilvl w:val="0"/>
-          <w:numId w:val="14"/>
+          <w:numId w:val="6"/>
         </w:numPr>
         <w:ind w:left="720" w:hanging="360"/>
         <w:rPr/>
@@ -12772,7 +12772,7 @@
       <w:pPr>
         <w:numPr>
           <w:ilvl w:val="0"/>
-          <w:numId w:val="14"/>
+          <w:numId w:val="6"/>
         </w:numPr>
         <w:ind w:left="720" w:hanging="360"/>
         <w:rPr/>
@@ -12811,7 +12811,7 @@
       <w:pPr>
         <w:numPr>
           <w:ilvl w:val="0"/>
-          <w:numId w:val="14"/>
+          <w:numId w:val="6"/>
         </w:numPr>
         <w:ind w:left="720" w:hanging="360"/>
         <w:rPr/>
@@ -12857,7 +12857,7 @@
       <w:pPr>
         <w:numPr>
           <w:ilvl w:val="0"/>
-          <w:numId w:val="14"/>
+          <w:numId w:val="6"/>
         </w:numPr>
         <w:ind w:left="720" w:hanging="360"/>
         <w:rPr/>
@@ -12892,7 +12892,7 @@
         </w:rPr>
       </w:r>
     </w:p>
-    <w:bookmarkStart w:colFirst="0" w:colLast="0" w:name="vlj5eo5vq5" w:id="28"/>
+    <w:bookmarkStart w:colFirst="0" w:colLast="0" w:name="86c78ieqluv6" w:id="28"/>
     <w:bookmarkEnd w:id="28"/>
     <w:p>
       <w:pPr>
@@ -13867,7 +13867,7 @@
         </w:rPr>
       </w:r>
     </w:p>
-    <w:bookmarkStart w:colFirst="0" w:colLast="0" w:name="rhxds3ypv1dl" w:id="29"/>
+    <w:bookmarkStart w:colFirst="0" w:colLast="0" w:name="313gcnes0fx" w:id="29"/>
     <w:bookmarkEnd w:id="29"/>
     <w:p>
       <w:pPr>
@@ -14019,7 +14019,7 @@
         </w:rPr>
       </w:r>
     </w:p>
-    <w:bookmarkStart w:colFirst="0" w:colLast="0" w:name="9l6v3g6fzm1w" w:id="30"/>
+    <w:bookmarkStart w:colFirst="0" w:colLast="0" w:name="o1hs342hlxuv" w:id="30"/>
     <w:bookmarkEnd w:id="30"/>
     <w:p>
       <w:pPr>
@@ -14047,7 +14047,7 @@
       <w:pPr>
         <w:numPr>
           <w:ilvl w:val="0"/>
-          <w:numId w:val="14"/>
+          <w:numId w:val="6"/>
         </w:numPr>
         <w:ind w:left="720" w:hanging="360"/>
         <w:rPr/>
@@ -14071,7 +14071,7 @@
       <w:pPr>
         <w:numPr>
           <w:ilvl w:val="0"/>
-          <w:numId w:val="14"/>
+          <w:numId w:val="6"/>
         </w:numPr>
         <w:ind w:left="720" w:hanging="360"/>
         <w:rPr/>
@@ -14110,7 +14110,7 @@
       <w:pPr>
         <w:numPr>
           <w:ilvl w:val="0"/>
-          <w:numId w:val="14"/>
+          <w:numId w:val="6"/>
         </w:numPr>
         <w:ind w:left="720" w:hanging="360"/>
         <w:rPr/>
@@ -14156,7 +14156,7 @@
       <w:pPr>
         <w:numPr>
           <w:ilvl w:val="0"/>
-          <w:numId w:val="14"/>
+          <w:numId w:val="6"/>
         </w:numPr>
         <w:ind w:left="720" w:hanging="360"/>
         <w:rPr/>
@@ -14176,7 +14176,7 @@
         <w:t xml:space="preserve"> Permettre aux développeurs un accès distant aux postes (RDP/SSH) et aux serveurs de développement, tout en bloquant strictement l’accès au pare-feu pfSense et au SIEM Wazuh.</w:t>
       </w:r>
     </w:p>
-    <w:bookmarkStart w:colFirst="0" w:colLast="0" w:name="s1ka03p2ywht" w:id="31"/>
+    <w:bookmarkStart w:colFirst="0" w:colLast="0" w:name="j5xu4wjlydxm" w:id="31"/>
     <w:bookmarkEnd w:id="31"/>
     <w:p>
       <w:pPr>
@@ -14878,27 +14878,27 @@
               <w:rPr>
                 <w:rtl w:val="0"/>
               </w:rPr>
-              <w:t xml:space="preserve">BLOCK</w:t>
-            </w:r>
-          </w:p>
-        </w:tc>
-        <w:tc>
-          <w:tcPr>
-            <w:tcBorders>
-              <w:top w:color="000000" w:space="0" w:sz="4" w:val="single"/>
-              <w:left w:color="000000" w:space="0" w:sz="4" w:val="single"/>
-              <w:bottom w:color="000000" w:space="0" w:sz="4" w:val="single"/>
-            </w:tcBorders>
-          </w:tcPr>
-          <w:p>
-            <w:pPr>
-              <w:rPr/>
-            </w:pPr>
-            <w:r>
-              <w:rPr>
-                <w:rtl w:val="0"/>
-              </w:rPr>
-              <w:t xml:space="preserve">Any</w:t>
+              <w:t xml:space="preserve">PASS</w:t>
+            </w:r>
+          </w:p>
+        </w:tc>
+        <w:tc>
+          <w:tcPr>
+            <w:tcBorders>
+              <w:top w:color="000000" w:space="0" w:sz="4" w:val="single"/>
+              <w:left w:color="000000" w:space="0" w:sz="4" w:val="single"/>
+              <w:bottom w:color="000000" w:space="0" w:sz="4" w:val="single"/>
+            </w:tcBorders>
+          </w:tcPr>
+          <w:p>
+            <w:pPr>
+              <w:rPr/>
+            </w:pPr>
+            <w:r>
+              <w:rPr>
+                <w:rtl w:val="0"/>
+              </w:rPr>
+              <w:t xml:space="preserve">TCP</w:t>
             </w:r>
           </w:p>
         </w:tc>
@@ -14936,55 +14936,49 @@
             </w:pPr>
             <w:r>
               <w:rPr>
-                <w:rFonts w:ascii="Georgia" w:cs="Georgia" w:eastAsia="Georgia" w:hAnsi="Georgia"/>
-                <w:rtl w:val="0"/>
-              </w:rPr>
-              <w:t xml:space="preserve">MGMT_NET</w:t>
-            </w:r>
-            <w:r>
-              <w:rPr>
-                <w:rtl w:val="0"/>
-              </w:rPr>
-            </w:r>
-          </w:p>
-        </w:tc>
-        <w:tc>
-          <w:tcPr>
-            <w:tcBorders>
-              <w:top w:color="000000" w:space="0" w:sz="4" w:val="single"/>
-              <w:left w:color="000000" w:space="0" w:sz="4" w:val="single"/>
-              <w:bottom w:color="000000" w:space="0" w:sz="4" w:val="single"/>
-            </w:tcBorders>
-          </w:tcPr>
-          <w:p>
-            <w:pPr>
-              <w:rPr/>
-            </w:pPr>
-            <w:r>
-              <w:rPr>
-                <w:rtl w:val="0"/>
-              </w:rPr>
-              <w:t xml:space="preserve">Any</w:t>
-            </w:r>
-          </w:p>
-        </w:tc>
-        <w:tc>
-          <w:tcPr>
-            <w:tcBorders>
-              <w:top w:color="000000" w:space="0" w:sz="4" w:val="single"/>
-              <w:left w:color="000000" w:space="0" w:sz="4" w:val="single"/>
-              <w:bottom w:color="000000" w:space="0" w:sz="4" w:val="single"/>
-            </w:tcBorders>
-          </w:tcPr>
-          <w:p>
-            <w:pPr>
-              <w:rPr/>
-            </w:pPr>
-            <w:r>
-              <w:rPr>
-                <w:rtl w:val="0"/>
-              </w:rPr>
-              <w:t xml:space="preserve">Isolation stricte du SIEM</w:t>
+                <w:rtl w:val="0"/>
+              </w:rPr>
+              <w:t xml:space="preserve">DMZ_NET</w:t>
+            </w:r>
+          </w:p>
+        </w:tc>
+        <w:tc>
+          <w:tcPr>
+            <w:tcBorders>
+              <w:top w:color="000000" w:space="0" w:sz="4" w:val="single"/>
+              <w:left w:color="000000" w:space="0" w:sz="4" w:val="single"/>
+              <w:bottom w:color="000000" w:space="0" w:sz="4" w:val="single"/>
+            </w:tcBorders>
+          </w:tcPr>
+          <w:p>
+            <w:pPr>
+              <w:rPr/>
+            </w:pPr>
+            <w:r>
+              <w:rPr>
+                <w:rtl w:val="0"/>
+              </w:rPr>
+              <w:t xml:space="preserve">443, 22</w:t>
+            </w:r>
+          </w:p>
+        </w:tc>
+        <w:tc>
+          <w:tcPr>
+            <w:tcBorders>
+              <w:top w:color="000000" w:space="0" w:sz="4" w:val="single"/>
+              <w:left w:color="000000" w:space="0" w:sz="4" w:val="single"/>
+              <w:bottom w:color="000000" w:space="0" w:sz="4" w:val="single"/>
+            </w:tcBorders>
+          </w:tcPr>
+          <w:p>
+            <w:pPr>
+              <w:rPr/>
+            </w:pPr>
+            <w:r>
+              <w:rPr>
+                <w:rtl w:val="0"/>
+              </w:rPr>
+              <w:t xml:space="preserve">Accès serveur web DMZ (développement)</w:t>
             </w:r>
           </w:p>
         </w:tc>
@@ -15087,6 +15081,157 @@
             </w:pPr>
             <w:r>
               <w:rPr>
+                <w:rFonts w:ascii="Georgia" w:cs="Georgia" w:eastAsia="Georgia" w:hAnsi="Georgia"/>
+                <w:rtl w:val="0"/>
+              </w:rPr>
+              <w:t xml:space="preserve">MGMT_NET</w:t>
+            </w:r>
+            <w:r>
+              <w:rPr>
+                <w:rtl w:val="0"/>
+              </w:rPr>
+            </w:r>
+          </w:p>
+        </w:tc>
+        <w:tc>
+          <w:tcPr>
+            <w:tcBorders>
+              <w:top w:color="000000" w:space="0" w:sz="4" w:val="single"/>
+              <w:left w:color="000000" w:space="0" w:sz="4" w:val="single"/>
+              <w:bottom w:color="000000" w:space="0" w:sz="4" w:val="single"/>
+            </w:tcBorders>
+          </w:tcPr>
+          <w:p>
+            <w:pPr>
+              <w:rPr/>
+            </w:pPr>
+            <w:r>
+              <w:rPr>
+                <w:rtl w:val="0"/>
+              </w:rPr>
+              <w:t xml:space="preserve">Any</w:t>
+            </w:r>
+          </w:p>
+        </w:tc>
+        <w:tc>
+          <w:tcPr>
+            <w:tcBorders>
+              <w:top w:color="000000" w:space="0" w:sz="4" w:val="single"/>
+              <w:left w:color="000000" w:space="0" w:sz="4" w:val="single"/>
+              <w:bottom w:color="000000" w:space="0" w:sz="4" w:val="single"/>
+            </w:tcBorders>
+          </w:tcPr>
+          <w:p>
+            <w:pPr>
+              <w:rPr/>
+            </w:pPr>
+            <w:r>
+              <w:rPr>
+                <w:rtl w:val="0"/>
+              </w:rPr>
+              <w:t xml:space="preserve">Isolation stricte du SIEM</w:t>
+            </w:r>
+          </w:p>
+        </w:tc>
+      </w:tr>
+      <w:tr>
+        <w:trPr>
+          <w:cantSplit w:val="1"/>
+          <w:tblHeader w:val="0"/>
+        </w:trPr>
+        <w:tc>
+          <w:tcPr>
+            <w:tcBorders>
+              <w:top w:color="000000" w:space="0" w:sz="4" w:val="single"/>
+              <w:bottom w:color="000000" w:space="0" w:sz="4" w:val="single"/>
+            </w:tcBorders>
+          </w:tcPr>
+          <w:p>
+            <w:pPr>
+              <w:rPr/>
+            </w:pPr>
+            <w:r>
+              <w:rPr>
+                <w:rtl w:val="0"/>
+              </w:rPr>
+              <w:t xml:space="preserve">6</w:t>
+            </w:r>
+          </w:p>
+        </w:tc>
+        <w:tc>
+          <w:tcPr>
+            <w:tcBorders>
+              <w:top w:color="000000" w:space="0" w:sz="4" w:val="single"/>
+              <w:left w:color="000000" w:space="0" w:sz="4" w:val="single"/>
+              <w:bottom w:color="000000" w:space="0" w:sz="4" w:val="single"/>
+            </w:tcBorders>
+          </w:tcPr>
+          <w:p>
+            <w:pPr>
+              <w:rPr/>
+            </w:pPr>
+            <w:r>
+              <w:rPr>
+                <w:rtl w:val="0"/>
+              </w:rPr>
+              <w:t xml:space="preserve">BLOCK</w:t>
+            </w:r>
+          </w:p>
+        </w:tc>
+        <w:tc>
+          <w:tcPr>
+            <w:tcBorders>
+              <w:top w:color="000000" w:space="0" w:sz="4" w:val="single"/>
+              <w:left w:color="000000" w:space="0" w:sz="4" w:val="single"/>
+              <w:bottom w:color="000000" w:space="0" w:sz="4" w:val="single"/>
+            </w:tcBorders>
+          </w:tcPr>
+          <w:p>
+            <w:pPr>
+              <w:rPr/>
+            </w:pPr>
+            <w:r>
+              <w:rPr>
+                <w:rtl w:val="0"/>
+              </w:rPr>
+              <w:t xml:space="preserve">Any</w:t>
+            </w:r>
+          </w:p>
+        </w:tc>
+        <w:tc>
+          <w:tcPr>
+            <w:tcBorders>
+              <w:top w:color="000000" w:space="0" w:sz="4" w:val="single"/>
+              <w:left w:color="000000" w:space="0" w:sz="4" w:val="single"/>
+              <w:bottom w:color="000000" w:space="0" w:sz="4" w:val="single"/>
+            </w:tcBorders>
+          </w:tcPr>
+          <w:p>
+            <w:pPr>
+              <w:rPr/>
+            </w:pPr>
+            <w:r>
+              <w:rPr>
+                <w:rtl w:val="0"/>
+              </w:rPr>
+              <w:t xml:space="preserve">10.10.20.0/24</w:t>
+            </w:r>
+          </w:p>
+        </w:tc>
+        <w:tc>
+          <w:tcPr>
+            <w:tcBorders>
+              <w:top w:color="000000" w:space="0" w:sz="4" w:val="single"/>
+              <w:left w:color="000000" w:space="0" w:sz="4" w:val="single"/>
+              <w:bottom w:color="000000" w:space="0" w:sz="4" w:val="single"/>
+            </w:tcBorders>
+          </w:tcPr>
+          <w:p>
+            <w:pPr>
+              <w:rPr/>
+            </w:pPr>
+            <w:r>
+              <w:rPr>
                 <w:rtl w:val="0"/>
               </w:rPr>
               <w:t xml:space="preserve">This Firewall (self)</w:t>
@@ -15145,7 +15290,7 @@
         </w:rPr>
       </w:r>
     </w:p>
-    <w:bookmarkStart w:colFirst="0" w:colLast="0" w:name="r6w2ar3strj7" w:id="32"/>
+    <w:bookmarkStart w:colFirst="0" w:colLast="0" w:name="bvqt31svfl97" w:id="32"/>
     <w:bookmarkEnd w:id="32"/>
     <w:p>
       <w:pPr>
@@ -15223,7 +15368,7 @@
         <w:br w:type="textWrapping"/>
         <w:t xml:space="preserve">Endpoint = &lt;IP_WAN_pfSense&gt;:51821</w:t>
         <w:br w:type="textWrapping"/>
-        <w:t xml:space="preserve">AllowedIPs = 192.168.10.128/25, 192.168.10.16/28, 192.168.10.32/29, 10.10.20.0/24</w:t>
+        <w:t xml:space="preserve">AllowedIPs = 192.168.10.0/28, 192.168.10.128/25, 192.168.10.16/28, 192.168.10.32/29, 10.10.20.0/24</w:t>
         <w:br w:type="textWrapping"/>
         <w:t xml:space="preserve">PersistentKeepalive = 25</w:t>
         <w:br w:type="textWrapping"/>
@@ -15254,7 +15399,7 @@
           <w:color w:val="666666"/>
           <w:rtl w:val="0"/>
         </w:rPr>
-        <w:t xml:space="preserve"> Le tunnel Développeurs écoute sur UDP 51821 (distinct du port 51820 réservé aux Administrateurs). Les AllowedIPs incluent uniquement les VLAN 30 (Workstations), VLAN 20 (Servers) et VLAN 40 (AD pour le DNS) — le VLAN 50 (MGMT/SIEM) et l’accès à la GUI pfSense sont explicitement bloqués.</w:t>
+        <w:t xml:space="preserve"> Le tunnel Développeurs écoute sur UDP 51821 (distinct du port 51820 réservé aux Administrateurs). Les AllowedIPs incluent le VLAN 10 (DMZ — accès serveur web sur ports 443/22 pour le développement), le VLAN 30 (Workstations), le VLAN 20 (Servers) et le VLAN 40 (AD pour le DNS) — le VLAN 50 (MGMT/SIEM) et l’accès à la GUI pfSense sont explicitement bloqués.</w:t>
       </w:r>
       <w:r>
         <w:rPr>
@@ -15277,7 +15422,7 @@
         </w:rPr>
       </w:r>
     </w:p>
-    <w:bookmarkStart w:colFirst="0" w:colLast="0" w:name="medn2q17d4vb" w:id="33"/>
+    <w:bookmarkStart w:colFirst="0" w:colLast="0" w:name="2kx12rjprpqk" w:id="33"/>
     <w:bookmarkEnd w:id="33"/>
     <w:p>
       <w:pPr>
@@ -15301,7 +15446,7 @@
         </w:rPr>
       </w:r>
     </w:p>
-    <w:bookmarkStart w:colFirst="0" w:colLast="0" w:name="t842wpjcw2o1" w:id="34"/>
+    <w:bookmarkStart w:colFirst="0" w:colLast="0" w:name="h71csf544v8e" w:id="34"/>
     <w:bookmarkEnd w:id="34"/>
     <w:p>
       <w:pPr>
@@ -15374,7 +15519,7 @@
         </w:rPr>
       </w:r>
     </w:p>
-    <w:bookmarkStart w:colFirst="0" w:colLast="0" w:name="j843nxu7becz" w:id="35"/>
+    <w:bookmarkStart w:colFirst="0" w:colLast="0" w:name="embce195tdn8" w:id="35"/>
     <w:bookmarkEnd w:id="35"/>
     <w:p>
       <w:pPr>
@@ -15916,7 +16061,7 @@
         </w:rPr>
       </w:r>
     </w:p>
-    <w:bookmarkStart w:colFirst="0" w:colLast="0" w:name="toe1s4a99ngt" w:id="36"/>
+    <w:bookmarkStart w:colFirst="0" w:colLast="0" w:name="3m8kah2rr54q" w:id="36"/>
     <w:bookmarkEnd w:id="36"/>
     <w:p>
       <w:pPr>
@@ -15940,7 +16085,7 @@
         </w:rPr>
       </w:r>
     </w:p>
-    <w:bookmarkStart w:colFirst="0" w:colLast="0" w:name="pht6indzqyz7" w:id="37"/>
+    <w:bookmarkStart w:colFirst="0" w:colLast="0" w:name="rpz38pmr396s" w:id="37"/>
     <w:bookmarkEnd w:id="37"/>
     <w:p>
       <w:pPr>
@@ -15968,7 +16113,7 @@
       <w:pPr>
         <w:numPr>
           <w:ilvl w:val="0"/>
-          <w:numId w:val="15"/>
+          <w:numId w:val="7"/>
         </w:numPr>
         <w:ind w:left="720" w:hanging="360"/>
         <w:rPr/>
@@ -16030,7 +16175,7 @@
       <w:pPr>
         <w:numPr>
           <w:ilvl w:val="0"/>
-          <w:numId w:val="15"/>
+          <w:numId w:val="7"/>
         </w:numPr>
         <w:ind w:left="720" w:hanging="360"/>
         <w:rPr/>
@@ -16067,7 +16212,7 @@
       <w:pPr>
         <w:numPr>
           <w:ilvl w:val="0"/>
-          <w:numId w:val="15"/>
+          <w:numId w:val="7"/>
         </w:numPr>
         <w:ind w:left="720" w:hanging="360"/>
         <w:rPr/>
@@ -16085,7 +16230,7 @@
         </w:rPr>
       </w:r>
     </w:p>
-    <w:bookmarkStart w:colFirst="0" w:colLast="0" w:name="vzd39gwdx64s" w:id="38"/>
+    <w:bookmarkStart w:colFirst="0" w:colLast="0" w:name="p2xx44av4nmq" w:id="38"/>
     <w:bookmarkEnd w:id="38"/>
     <w:p>
       <w:pPr>
@@ -16437,7 +16582,7 @@
         </w:rPr>
       </w:r>
     </w:p>
-    <w:bookmarkStart w:colFirst="0" w:colLast="0" w:name="o24zsigliw8o" w:id="39"/>
+    <w:bookmarkStart w:colFirst="0" w:colLast="0" w:name="cjkjn6a8yyq7" w:id="39"/>
     <w:bookmarkEnd w:id="39"/>
     <w:p>
       <w:pPr>
@@ -16461,7 +16606,7 @@
         </w:rPr>
       </w:r>
     </w:p>
-    <w:bookmarkStart w:colFirst="0" w:colLast="0" w:name="bp5b4k6xs1qh" w:id="40"/>
+    <w:bookmarkStart w:colFirst="0" w:colLast="0" w:name="m1vgewrxflex" w:id="40"/>
     <w:bookmarkEnd w:id="40"/>
     <w:p>
       <w:pPr>
@@ -16489,7 +16634,7 @@
       <w:pPr>
         <w:numPr>
           <w:ilvl w:val="0"/>
-          <w:numId w:val="5"/>
+          <w:numId w:val="11"/>
         </w:numPr>
         <w:ind w:left="720" w:hanging="360"/>
         <w:rPr/>
@@ -16519,7 +16664,7 @@
       <w:pPr>
         <w:numPr>
           <w:ilvl w:val="0"/>
-          <w:numId w:val="5"/>
+          <w:numId w:val="11"/>
         </w:numPr>
         <w:ind w:left="720" w:hanging="360"/>
         <w:rPr/>
@@ -16565,7 +16710,7 @@
       <w:pPr>
         <w:numPr>
           <w:ilvl w:val="0"/>
-          <w:numId w:val="5"/>
+          <w:numId w:val="11"/>
         </w:numPr>
         <w:ind w:left="720" w:hanging="360"/>
         <w:rPr/>
@@ -16606,7 +16751,7 @@
       <w:pPr>
         <w:numPr>
           <w:ilvl w:val="0"/>
-          <w:numId w:val="5"/>
+          <w:numId w:val="11"/>
         </w:numPr>
         <w:ind w:left="720" w:hanging="360"/>
         <w:rPr/>
@@ -16632,7 +16777,7 @@
         </w:rPr>
       </w:r>
     </w:p>
-    <w:bookmarkStart w:colFirst="0" w:colLast="0" w:name="7yea1so7iyk2" w:id="41"/>
+    <w:bookmarkStart w:colFirst="0" w:colLast="0" w:name="aiy9mq2lj2hd" w:id="41"/>
     <w:bookmarkEnd w:id="41"/>
     <w:p>
       <w:pPr>
@@ -16660,7 +16805,7 @@
       <w:pPr>
         <w:numPr>
           <w:ilvl w:val="0"/>
-          <w:numId w:val="6"/>
+          <w:numId w:val="12"/>
         </w:numPr>
         <w:ind w:left="720" w:hanging="360"/>
         <w:rPr/>
@@ -16690,7 +16835,7 @@
       <w:pPr>
         <w:numPr>
           <w:ilvl w:val="0"/>
-          <w:numId w:val="6"/>
+          <w:numId w:val="12"/>
         </w:numPr>
         <w:ind w:left="720" w:hanging="360"/>
         <w:rPr/>
@@ -16720,7 +16865,7 @@
       <w:pPr>
         <w:numPr>
           <w:ilvl w:val="0"/>
-          <w:numId w:val="6"/>
+          <w:numId w:val="12"/>
         </w:numPr>
         <w:ind w:left="720" w:hanging="360"/>
         <w:rPr/>
@@ -16826,7 +16971,7 @@
         </w:rPr>
       </w:r>
     </w:p>
-    <w:bookmarkStart w:colFirst="0" w:colLast="0" w:name="afjj131njaju" w:id="42"/>
+    <w:bookmarkStart w:colFirst="0" w:colLast="0" w:name="35p659p41cm8" w:id="42"/>
     <w:bookmarkEnd w:id="42"/>
     <w:p>
       <w:pPr>
@@ -16864,7 +17009,7 @@
           <w:szCs w:val="26"/>
         </w:rPr>
       </w:pPr>
-      <w:bookmarkStart w:colFirst="0" w:colLast="0" w:name="_moy9nu79tbnk" w:id="43"/>
+      <w:bookmarkStart w:colFirst="0" w:colLast="0" w:name="_q2io4yb4bp13" w:id="43"/>
       <w:bookmarkEnd w:id="43"/>
       <w:r>
         <w:rPr>
@@ -16881,8 +17026,9 @@
           <w:ilvl w:val="0"/>
           <w:numId w:val="1"/>
         </w:numPr>
-        <w:spacing w:after="0" w:afterAutospacing="0" w:before="240" w:lineRule="auto"/>
+        <w:spacing w:after="0" w:before="240" w:lineRule="auto"/>
         <w:ind w:left="720" w:hanging="360"/>
+        <w:rPr/>
       </w:pPr>
       <w:r>
         <w:rPr>
@@ -16905,8 +17051,9 @@
           <w:ilvl w:val="0"/>
           <w:numId w:val="1"/>
         </w:numPr>
-        <w:spacing w:after="240" w:before="0" w:beforeAutospacing="0" w:lineRule="auto"/>
+        <w:spacing w:after="240" w:before="0" w:lineRule="auto"/>
         <w:ind w:left="720" w:hanging="360"/>
+        <w:rPr/>
       </w:pPr>
       <w:r>
         <w:rPr>
@@ -16922,6 +17069,11 @@
           <w:rtl w:val="0"/>
         </w:rPr>
         <w:t xml:space="preserve"> → Redondance L2, agrégation de liens vers pfSense (LACP) pour résilience physique et gain de bande passante</w:t>
+      </w:r>
+      <w:r>
+        <w:rPr>
+          <w:rtl w:val="0"/>
+        </w:rPr>
       </w:r>
     </w:p>
     <w:p>
@@ -16951,7 +17103,7 @@
           <w:szCs w:val="26"/>
         </w:rPr>
       </w:pPr>
-      <w:bookmarkStart w:colFirst="0" w:colLast="0" w:name="_8gzt1k36waqw" w:id="44"/>
+      <w:bookmarkStart w:colFirst="0" w:colLast="0" w:name="_4uzw39pfbv91" w:id="44"/>
       <w:bookmarkEnd w:id="44"/>
       <w:r>
         <w:rPr>
@@ -16966,10 +17118,11 @@
       <w:pPr>
         <w:numPr>
           <w:ilvl w:val="0"/>
-          <w:numId w:val="3"/>
+          <w:numId w:val="9"/>
         </w:numPr>
-        <w:spacing w:after="0" w:afterAutospacing="0" w:before="240" w:lineRule="auto"/>
+        <w:spacing w:after="0" w:before="240" w:lineRule="auto"/>
         <w:ind w:left="720" w:hanging="360"/>
+        <w:rPr/>
       </w:pPr>
       <w:r>
         <w:rPr>
@@ -16990,10 +17143,11 @@
       <w:pPr>
         <w:numPr>
           <w:ilvl w:val="0"/>
-          <w:numId w:val="3"/>
+          <w:numId w:val="9"/>
         </w:numPr>
-        <w:spacing w:after="0" w:afterAutospacing="0" w:before="0" w:beforeAutospacing="0" w:lineRule="auto"/>
+        <w:spacing w:after="0" w:before="0" w:lineRule="auto"/>
         <w:ind w:left="720" w:hanging="360"/>
+        <w:rPr/>
       </w:pPr>
       <w:r>
         <w:rPr>
@@ -17014,10 +17168,11 @@
       <w:pPr>
         <w:numPr>
           <w:ilvl w:val="0"/>
-          <w:numId w:val="3"/>
+          <w:numId w:val="9"/>
         </w:numPr>
-        <w:spacing w:after="240" w:before="0" w:beforeAutospacing="0" w:lineRule="auto"/>
+        <w:spacing w:after="240" w:before="0" w:lineRule="auto"/>
         <w:ind w:left="720" w:hanging="360"/>
+        <w:rPr/>
       </w:pPr>
       <w:r>
         <w:rPr>
@@ -17061,7 +17216,7 @@
           <w:szCs w:val="26"/>
         </w:rPr>
       </w:pPr>
-      <w:bookmarkStart w:colFirst="0" w:colLast="0" w:name="_ugqd5ste2mgw" w:id="45"/>
+      <w:bookmarkStart w:colFirst="0" w:colLast="0" w:name="_n0q5b5cj9zsj" w:id="45"/>
       <w:bookmarkEnd w:id="45"/>
       <w:r>
         <w:rPr>
@@ -17159,10 +17314,11 @@
       <w:pPr>
         <w:numPr>
           <w:ilvl w:val="0"/>
-          <w:numId w:val="2"/>
+          <w:numId w:val="8"/>
         </w:numPr>
-        <w:spacing w:after="0" w:afterAutospacing="0" w:before="240" w:lineRule="auto"/>
+        <w:spacing w:after="0" w:before="240" w:lineRule="auto"/>
         <w:ind w:left="720" w:hanging="360"/>
+        <w:rPr/>
       </w:pPr>
       <w:r>
         <w:rPr>
@@ -17189,10 +17345,11 @@
       <w:pPr>
         <w:numPr>
           <w:ilvl w:val="0"/>
-          <w:numId w:val="2"/>
+          <w:numId w:val="8"/>
         </w:numPr>
-        <w:spacing w:after="0" w:afterAutospacing="0" w:before="0" w:beforeAutospacing="0" w:lineRule="auto"/>
+        <w:spacing w:after="0" w:before="0" w:lineRule="auto"/>
         <w:ind w:left="720" w:hanging="360"/>
+        <w:rPr/>
       </w:pPr>
       <w:r>
         <w:rPr>
@@ -17247,10 +17404,11 @@
       <w:pPr>
         <w:numPr>
           <w:ilvl w:val="0"/>
-          <w:numId w:val="2"/>
+          <w:numId w:val="8"/>
         </w:numPr>
-        <w:spacing w:after="0" w:afterAutospacing="0" w:before="0" w:beforeAutospacing="0" w:lineRule="auto"/>
+        <w:spacing w:after="0" w:before="0" w:lineRule="auto"/>
         <w:ind w:left="720" w:hanging="360"/>
+        <w:rPr/>
       </w:pPr>
       <w:r>
         <w:rPr>
@@ -17263,10 +17421,11 @@
       <w:pPr>
         <w:numPr>
           <w:ilvl w:val="0"/>
-          <w:numId w:val="2"/>
+          <w:numId w:val="8"/>
         </w:numPr>
-        <w:spacing w:after="0" w:afterAutospacing="0" w:before="0" w:beforeAutospacing="0" w:lineRule="auto"/>
+        <w:spacing w:after="0" w:before="0" w:lineRule="auto"/>
         <w:ind w:left="720" w:hanging="360"/>
+        <w:rPr/>
       </w:pPr>
       <w:r>
         <w:rPr>
@@ -17307,10 +17466,11 @@
       <w:pPr>
         <w:numPr>
           <w:ilvl w:val="0"/>
-          <w:numId w:val="2"/>
+          <w:numId w:val="8"/>
         </w:numPr>
-        <w:spacing w:after="240" w:before="0" w:beforeAutospacing="0" w:lineRule="auto"/>
+        <w:spacing w:after="240" w:before="0" w:lineRule="auto"/>
         <w:ind w:left="720" w:hanging="360"/>
+        <w:rPr/>
       </w:pPr>
       <w:r>
         <w:rPr>
@@ -17377,7 +17537,7 @@
         </w:rPr>
       </w:r>
     </w:p>
-    <w:bookmarkStart w:colFirst="0" w:colLast="0" w:name="swuie5gus8i" w:id="46"/>
+    <w:bookmarkStart w:colFirst="0" w:colLast="0" w:name="2vlqykr53v3" w:id="46"/>
     <w:bookmarkEnd w:id="46"/>
     <w:p>
       <w:pPr>
@@ -17522,7 +17682,7 @@
       <w:pPr>
         <w:numPr>
           <w:ilvl w:val="0"/>
-          <w:numId w:val="7"/>
+          <w:numId w:val="13"/>
         </w:numPr>
         <w:ind w:left="720" w:hanging="360"/>
         <w:rPr/>
@@ -17544,7 +17704,7 @@
       <w:pPr>
         <w:numPr>
           <w:ilvl w:val="0"/>
-          <w:numId w:val="7"/>
+          <w:numId w:val="13"/>
         </w:numPr>
         <w:ind w:left="720" w:hanging="360"/>
         <w:rPr/>
@@ -17566,7 +17726,7 @@
       <w:pPr>
         <w:numPr>
           <w:ilvl w:val="0"/>
-          <w:numId w:val="7"/>
+          <w:numId w:val="13"/>
         </w:numPr>
         <w:ind w:left="720" w:hanging="360"/>
         <w:rPr/>
@@ -17596,7 +17756,7 @@
       <w:pPr>
         <w:numPr>
           <w:ilvl w:val="0"/>
-          <w:numId w:val="7"/>
+          <w:numId w:val="13"/>
         </w:numPr>
         <w:ind w:left="720" w:hanging="360"/>
         <w:rPr/>
@@ -17618,7 +17778,7 @@
       <w:pPr>
         <w:numPr>
           <w:ilvl w:val="0"/>
-          <w:numId w:val="7"/>
+          <w:numId w:val="13"/>
         </w:numPr>
         <w:ind w:left="720" w:hanging="360"/>
         <w:rPr/>
@@ -17649,7 +17809,7 @@
       <w:pPr>
         <w:numPr>
           <w:ilvl w:val="0"/>
-          <w:numId w:val="7"/>
+          <w:numId w:val="13"/>
         </w:numPr>
         <w:ind w:left="720" w:hanging="360"/>
         <w:rPr/>
@@ -17671,7 +17831,7 @@
       <w:pPr>
         <w:numPr>
           <w:ilvl w:val="0"/>
-          <w:numId w:val="7"/>
+          <w:numId w:val="13"/>
         </w:numPr>
         <w:ind w:left="720" w:hanging="360"/>
         <w:rPr/>
@@ -17693,7 +17853,7 @@
       <w:pPr>
         <w:numPr>
           <w:ilvl w:val="0"/>
-          <w:numId w:val="7"/>
+          <w:numId w:val="13"/>
         </w:numPr>
         <w:ind w:left="720" w:hanging="360"/>
         <w:rPr/>
@@ -17885,6 +18045,568 @@
         <w:ind w:left="720" w:hanging="360"/>
       </w:pPr>
       <w:rPr>
+        <w:rFonts w:ascii="Noto Sans Symbols" w:cs="Noto Sans Symbols" w:eastAsia="Noto Sans Symbols" w:hAnsi="Noto Sans Symbols"/>
+      </w:rPr>
+    </w:lvl>
+    <w:lvl w:ilvl="1">
+      <w:start w:val="1"/>
+      <w:numFmt w:val="bullet"/>
+      <w:lvlText w:val=""/>
+      <w:lvlJc w:val="left"/>
+      <w:pPr>
+        <w:ind w:left="0" w:firstLine="0"/>
+      </w:pPr>
+      <w:rPr/>
+    </w:lvl>
+    <w:lvl w:ilvl="2">
+      <w:start w:val="1"/>
+      <w:numFmt w:val="bullet"/>
+      <w:lvlText w:val=""/>
+      <w:lvlJc w:val="left"/>
+      <w:pPr>
+        <w:ind w:left="0" w:firstLine="0"/>
+      </w:pPr>
+      <w:rPr/>
+    </w:lvl>
+    <w:lvl w:ilvl="3">
+      <w:start w:val="1"/>
+      <w:numFmt w:val="bullet"/>
+      <w:lvlText w:val=""/>
+      <w:lvlJc w:val="left"/>
+      <w:pPr>
+        <w:ind w:left="0" w:firstLine="0"/>
+      </w:pPr>
+      <w:rPr/>
+    </w:lvl>
+    <w:lvl w:ilvl="4">
+      <w:start w:val="1"/>
+      <w:numFmt w:val="bullet"/>
+      <w:lvlText w:val=""/>
+      <w:lvlJc w:val="left"/>
+      <w:pPr>
+        <w:ind w:left="0" w:firstLine="0"/>
+      </w:pPr>
+      <w:rPr/>
+    </w:lvl>
+    <w:lvl w:ilvl="5">
+      <w:start w:val="1"/>
+      <w:numFmt w:val="bullet"/>
+      <w:lvlText w:val=""/>
+      <w:lvlJc w:val="left"/>
+      <w:pPr>
+        <w:ind w:left="0" w:firstLine="0"/>
+      </w:pPr>
+      <w:rPr/>
+    </w:lvl>
+    <w:lvl w:ilvl="6">
+      <w:start w:val="1"/>
+      <w:numFmt w:val="bullet"/>
+      <w:lvlText w:val=""/>
+      <w:lvlJc w:val="left"/>
+      <w:pPr>
+        <w:ind w:left="0" w:firstLine="0"/>
+      </w:pPr>
+      <w:rPr/>
+    </w:lvl>
+    <w:lvl w:ilvl="7">
+      <w:start w:val="1"/>
+      <w:numFmt w:val="bullet"/>
+      <w:lvlText w:val=""/>
+      <w:lvlJc w:val="left"/>
+      <w:pPr>
+        <w:ind w:left="0" w:firstLine="0"/>
+      </w:pPr>
+      <w:rPr/>
+    </w:lvl>
+    <w:lvl w:ilvl="8">
+      <w:start w:val="1"/>
+      <w:numFmt w:val="bullet"/>
+      <w:lvlText w:val=""/>
+      <w:lvlJc w:val="left"/>
+      <w:pPr>
+        <w:ind w:left="0" w:firstLine="0"/>
+      </w:pPr>
+      <w:rPr/>
+    </w:lvl>
+  </w:abstractNum>
+  <w:abstractNum w:abstractNumId="3">
+    <w:lvl w:ilvl="0">
+      <w:start w:val="1"/>
+      <w:numFmt w:val="bullet"/>
+      <w:lvlText w:val="●"/>
+      <w:lvlJc w:val="left"/>
+      <w:pPr>
+        <w:ind w:left="720" w:hanging="360"/>
+      </w:pPr>
+      <w:rPr>
+        <w:rFonts w:ascii="Noto Sans Symbols" w:cs="Noto Sans Symbols" w:eastAsia="Noto Sans Symbols" w:hAnsi="Noto Sans Symbols"/>
+      </w:rPr>
+    </w:lvl>
+    <w:lvl w:ilvl="1">
+      <w:start w:val="1"/>
+      <w:numFmt w:val="bullet"/>
+      <w:lvlText w:val=""/>
+      <w:lvlJc w:val="left"/>
+      <w:pPr>
+        <w:ind w:left="0" w:firstLine="0"/>
+      </w:pPr>
+      <w:rPr/>
+    </w:lvl>
+    <w:lvl w:ilvl="2">
+      <w:start w:val="1"/>
+      <w:numFmt w:val="bullet"/>
+      <w:lvlText w:val=""/>
+      <w:lvlJc w:val="left"/>
+      <w:pPr>
+        <w:ind w:left="0" w:firstLine="0"/>
+      </w:pPr>
+      <w:rPr/>
+    </w:lvl>
+    <w:lvl w:ilvl="3">
+      <w:start w:val="1"/>
+      <w:numFmt w:val="bullet"/>
+      <w:lvlText w:val=""/>
+      <w:lvlJc w:val="left"/>
+      <w:pPr>
+        <w:ind w:left="0" w:firstLine="0"/>
+      </w:pPr>
+      <w:rPr/>
+    </w:lvl>
+    <w:lvl w:ilvl="4">
+      <w:start w:val="1"/>
+      <w:numFmt w:val="bullet"/>
+      <w:lvlText w:val=""/>
+      <w:lvlJc w:val="left"/>
+      <w:pPr>
+        <w:ind w:left="0" w:firstLine="0"/>
+      </w:pPr>
+      <w:rPr/>
+    </w:lvl>
+    <w:lvl w:ilvl="5">
+      <w:start w:val="1"/>
+      <w:numFmt w:val="bullet"/>
+      <w:lvlText w:val=""/>
+      <w:lvlJc w:val="left"/>
+      <w:pPr>
+        <w:ind w:left="0" w:firstLine="0"/>
+      </w:pPr>
+      <w:rPr/>
+    </w:lvl>
+    <w:lvl w:ilvl="6">
+      <w:start w:val="1"/>
+      <w:numFmt w:val="bullet"/>
+      <w:lvlText w:val=""/>
+      <w:lvlJc w:val="left"/>
+      <w:pPr>
+        <w:ind w:left="0" w:firstLine="0"/>
+      </w:pPr>
+      <w:rPr/>
+    </w:lvl>
+    <w:lvl w:ilvl="7">
+      <w:start w:val="1"/>
+      <w:numFmt w:val="bullet"/>
+      <w:lvlText w:val=""/>
+      <w:lvlJc w:val="left"/>
+      <w:pPr>
+        <w:ind w:left="0" w:firstLine="0"/>
+      </w:pPr>
+      <w:rPr/>
+    </w:lvl>
+    <w:lvl w:ilvl="8">
+      <w:start w:val="1"/>
+      <w:numFmt w:val="bullet"/>
+      <w:lvlText w:val=""/>
+      <w:lvlJc w:val="left"/>
+      <w:pPr>
+        <w:ind w:left="0" w:firstLine="0"/>
+      </w:pPr>
+      <w:rPr/>
+    </w:lvl>
+  </w:abstractNum>
+  <w:abstractNum w:abstractNumId="4">
+    <w:lvl w:ilvl="0">
+      <w:start w:val="1"/>
+      <w:numFmt w:val="bullet"/>
+      <w:lvlText w:val="●"/>
+      <w:lvlJc w:val="left"/>
+      <w:pPr>
+        <w:ind w:left="720" w:hanging="360"/>
+      </w:pPr>
+      <w:rPr>
+        <w:rFonts w:ascii="Noto Sans Symbols" w:cs="Noto Sans Symbols" w:eastAsia="Noto Sans Symbols" w:hAnsi="Noto Sans Symbols"/>
+      </w:rPr>
+    </w:lvl>
+    <w:lvl w:ilvl="1">
+      <w:start w:val="1"/>
+      <w:numFmt w:val="bullet"/>
+      <w:lvlText w:val=""/>
+      <w:lvlJc w:val="left"/>
+      <w:pPr>
+        <w:ind w:left="0" w:firstLine="0"/>
+      </w:pPr>
+      <w:rPr/>
+    </w:lvl>
+    <w:lvl w:ilvl="2">
+      <w:start w:val="1"/>
+      <w:numFmt w:val="bullet"/>
+      <w:lvlText w:val=""/>
+      <w:lvlJc w:val="left"/>
+      <w:pPr>
+        <w:ind w:left="0" w:firstLine="0"/>
+      </w:pPr>
+      <w:rPr/>
+    </w:lvl>
+    <w:lvl w:ilvl="3">
+      <w:start w:val="1"/>
+      <w:numFmt w:val="bullet"/>
+      <w:lvlText w:val=""/>
+      <w:lvlJc w:val="left"/>
+      <w:pPr>
+        <w:ind w:left="0" w:firstLine="0"/>
+      </w:pPr>
+      <w:rPr/>
+    </w:lvl>
+    <w:lvl w:ilvl="4">
+      <w:start w:val="1"/>
+      <w:numFmt w:val="bullet"/>
+      <w:lvlText w:val=""/>
+      <w:lvlJc w:val="left"/>
+      <w:pPr>
+        <w:ind w:left="0" w:firstLine="0"/>
+      </w:pPr>
+      <w:rPr/>
+    </w:lvl>
+    <w:lvl w:ilvl="5">
+      <w:start w:val="1"/>
+      <w:numFmt w:val="bullet"/>
+      <w:lvlText w:val=""/>
+      <w:lvlJc w:val="left"/>
+      <w:pPr>
+        <w:ind w:left="0" w:firstLine="0"/>
+      </w:pPr>
+      <w:rPr/>
+    </w:lvl>
+    <w:lvl w:ilvl="6">
+      <w:start w:val="1"/>
+      <w:numFmt w:val="bullet"/>
+      <w:lvlText w:val=""/>
+      <w:lvlJc w:val="left"/>
+      <w:pPr>
+        <w:ind w:left="0" w:firstLine="0"/>
+      </w:pPr>
+      <w:rPr/>
+    </w:lvl>
+    <w:lvl w:ilvl="7">
+      <w:start w:val="1"/>
+      <w:numFmt w:val="bullet"/>
+      <w:lvlText w:val=""/>
+      <w:lvlJc w:val="left"/>
+      <w:pPr>
+        <w:ind w:left="0" w:firstLine="0"/>
+      </w:pPr>
+      <w:rPr/>
+    </w:lvl>
+    <w:lvl w:ilvl="8">
+      <w:start w:val="1"/>
+      <w:numFmt w:val="bullet"/>
+      <w:lvlText w:val=""/>
+      <w:lvlJc w:val="left"/>
+      <w:pPr>
+        <w:ind w:left="0" w:firstLine="0"/>
+      </w:pPr>
+      <w:rPr/>
+    </w:lvl>
+  </w:abstractNum>
+  <w:abstractNum w:abstractNumId="5">
+    <w:lvl w:ilvl="0">
+      <w:start w:val="1"/>
+      <w:numFmt w:val="decimal"/>
+      <w:lvlText w:val="%1."/>
+      <w:lvlJc w:val="left"/>
+      <w:pPr>
+        <w:ind w:left="720" w:hanging="360"/>
+      </w:pPr>
+      <w:rPr/>
+    </w:lvl>
+    <w:lvl w:ilvl="1">
+      <w:start w:val="1"/>
+      <w:numFmt w:val="bullet"/>
+      <w:lvlText w:val=""/>
+      <w:lvlJc w:val="left"/>
+      <w:pPr>
+        <w:ind w:left="0" w:firstLine="0"/>
+      </w:pPr>
+      <w:rPr/>
+    </w:lvl>
+    <w:lvl w:ilvl="2">
+      <w:start w:val="1"/>
+      <w:numFmt w:val="bullet"/>
+      <w:lvlText w:val=""/>
+      <w:lvlJc w:val="left"/>
+      <w:pPr>
+        <w:ind w:left="0" w:firstLine="0"/>
+      </w:pPr>
+      <w:rPr/>
+    </w:lvl>
+    <w:lvl w:ilvl="3">
+      <w:start w:val="1"/>
+      <w:numFmt w:val="bullet"/>
+      <w:lvlText w:val=""/>
+      <w:lvlJc w:val="left"/>
+      <w:pPr>
+        <w:ind w:left="0" w:firstLine="0"/>
+      </w:pPr>
+      <w:rPr/>
+    </w:lvl>
+    <w:lvl w:ilvl="4">
+      <w:start w:val="1"/>
+      <w:numFmt w:val="bullet"/>
+      <w:lvlText w:val=""/>
+      <w:lvlJc w:val="left"/>
+      <w:pPr>
+        <w:ind w:left="0" w:firstLine="0"/>
+      </w:pPr>
+      <w:rPr/>
+    </w:lvl>
+    <w:lvl w:ilvl="5">
+      <w:start w:val="1"/>
+      <w:numFmt w:val="bullet"/>
+      <w:lvlText w:val=""/>
+      <w:lvlJc w:val="left"/>
+      <w:pPr>
+        <w:ind w:left="0" w:firstLine="0"/>
+      </w:pPr>
+      <w:rPr/>
+    </w:lvl>
+    <w:lvl w:ilvl="6">
+      <w:start w:val="1"/>
+      <w:numFmt w:val="bullet"/>
+      <w:lvlText w:val=""/>
+      <w:lvlJc w:val="left"/>
+      <w:pPr>
+        <w:ind w:left="0" w:firstLine="0"/>
+      </w:pPr>
+      <w:rPr/>
+    </w:lvl>
+    <w:lvl w:ilvl="7">
+      <w:start w:val="1"/>
+      <w:numFmt w:val="bullet"/>
+      <w:lvlText w:val=""/>
+      <w:lvlJc w:val="left"/>
+      <w:pPr>
+        <w:ind w:left="0" w:firstLine="0"/>
+      </w:pPr>
+      <w:rPr/>
+    </w:lvl>
+    <w:lvl w:ilvl="8">
+      <w:start w:val="1"/>
+      <w:numFmt w:val="bullet"/>
+      <w:lvlText w:val=""/>
+      <w:lvlJc w:val="left"/>
+      <w:pPr>
+        <w:ind w:left="0" w:firstLine="0"/>
+      </w:pPr>
+      <w:rPr/>
+    </w:lvl>
+  </w:abstractNum>
+  <w:abstractNum w:abstractNumId="6">
+    <w:lvl w:ilvl="0">
+      <w:start w:val="1"/>
+      <w:numFmt w:val="bullet"/>
+      <w:lvlText w:val="●"/>
+      <w:lvlJc w:val="left"/>
+      <w:pPr>
+        <w:ind w:left="720" w:hanging="360"/>
+      </w:pPr>
+      <w:rPr>
+        <w:rFonts w:ascii="Noto Sans Symbols" w:cs="Noto Sans Symbols" w:eastAsia="Noto Sans Symbols" w:hAnsi="Noto Sans Symbols"/>
+      </w:rPr>
+    </w:lvl>
+    <w:lvl w:ilvl="1">
+      <w:start w:val="1"/>
+      <w:numFmt w:val="bullet"/>
+      <w:lvlText w:val=""/>
+      <w:lvlJc w:val="left"/>
+      <w:pPr>
+        <w:ind w:left="0" w:firstLine="0"/>
+      </w:pPr>
+      <w:rPr/>
+    </w:lvl>
+    <w:lvl w:ilvl="2">
+      <w:start w:val="1"/>
+      <w:numFmt w:val="bullet"/>
+      <w:lvlText w:val=""/>
+      <w:lvlJc w:val="left"/>
+      <w:pPr>
+        <w:ind w:left="0" w:firstLine="0"/>
+      </w:pPr>
+      <w:rPr/>
+    </w:lvl>
+    <w:lvl w:ilvl="3">
+      <w:start w:val="1"/>
+      <w:numFmt w:val="bullet"/>
+      <w:lvlText w:val=""/>
+      <w:lvlJc w:val="left"/>
+      <w:pPr>
+        <w:ind w:left="0" w:firstLine="0"/>
+      </w:pPr>
+      <w:rPr/>
+    </w:lvl>
+    <w:lvl w:ilvl="4">
+      <w:start w:val="1"/>
+      <w:numFmt w:val="bullet"/>
+      <w:lvlText w:val=""/>
+      <w:lvlJc w:val="left"/>
+      <w:pPr>
+        <w:ind w:left="0" w:firstLine="0"/>
+      </w:pPr>
+      <w:rPr/>
+    </w:lvl>
+    <w:lvl w:ilvl="5">
+      <w:start w:val="1"/>
+      <w:numFmt w:val="bullet"/>
+      <w:lvlText w:val=""/>
+      <w:lvlJc w:val="left"/>
+      <w:pPr>
+        <w:ind w:left="0" w:firstLine="0"/>
+      </w:pPr>
+      <w:rPr/>
+    </w:lvl>
+    <w:lvl w:ilvl="6">
+      <w:start w:val="1"/>
+      <w:numFmt w:val="bullet"/>
+      <w:lvlText w:val=""/>
+      <w:lvlJc w:val="left"/>
+      <w:pPr>
+        <w:ind w:left="0" w:firstLine="0"/>
+      </w:pPr>
+      <w:rPr/>
+    </w:lvl>
+    <w:lvl w:ilvl="7">
+      <w:start w:val="1"/>
+      <w:numFmt w:val="bullet"/>
+      <w:lvlText w:val=""/>
+      <w:lvlJc w:val="left"/>
+      <w:pPr>
+        <w:ind w:left="0" w:firstLine="0"/>
+      </w:pPr>
+      <w:rPr/>
+    </w:lvl>
+    <w:lvl w:ilvl="8">
+      <w:start w:val="1"/>
+      <w:numFmt w:val="bullet"/>
+      <w:lvlText w:val=""/>
+      <w:lvlJc w:val="left"/>
+      <w:pPr>
+        <w:ind w:left="0" w:firstLine="0"/>
+      </w:pPr>
+      <w:rPr/>
+    </w:lvl>
+  </w:abstractNum>
+  <w:abstractNum w:abstractNumId="7">
+    <w:lvl w:ilvl="0">
+      <w:start w:val="1"/>
+      <w:numFmt w:val="bullet"/>
+      <w:lvlText w:val="●"/>
+      <w:lvlJc w:val="left"/>
+      <w:pPr>
+        <w:ind w:left="720" w:hanging="360"/>
+      </w:pPr>
+      <w:rPr>
+        <w:rFonts w:ascii="Noto Sans Symbols" w:cs="Noto Sans Symbols" w:eastAsia="Noto Sans Symbols" w:hAnsi="Noto Sans Symbols"/>
+      </w:rPr>
+    </w:lvl>
+    <w:lvl w:ilvl="1">
+      <w:start w:val="1"/>
+      <w:numFmt w:val="bullet"/>
+      <w:lvlText w:val=""/>
+      <w:lvlJc w:val="left"/>
+      <w:pPr>
+        <w:ind w:left="0" w:firstLine="0"/>
+      </w:pPr>
+      <w:rPr/>
+    </w:lvl>
+    <w:lvl w:ilvl="2">
+      <w:start w:val="1"/>
+      <w:numFmt w:val="bullet"/>
+      <w:lvlText w:val=""/>
+      <w:lvlJc w:val="left"/>
+      <w:pPr>
+        <w:ind w:left="0" w:firstLine="0"/>
+      </w:pPr>
+      <w:rPr/>
+    </w:lvl>
+    <w:lvl w:ilvl="3">
+      <w:start w:val="1"/>
+      <w:numFmt w:val="bullet"/>
+      <w:lvlText w:val=""/>
+      <w:lvlJc w:val="left"/>
+      <w:pPr>
+        <w:ind w:left="0" w:firstLine="0"/>
+      </w:pPr>
+      <w:rPr/>
+    </w:lvl>
+    <w:lvl w:ilvl="4">
+      <w:start w:val="1"/>
+      <w:numFmt w:val="bullet"/>
+      <w:lvlText w:val=""/>
+      <w:lvlJc w:val="left"/>
+      <w:pPr>
+        <w:ind w:left="0" w:firstLine="0"/>
+      </w:pPr>
+      <w:rPr/>
+    </w:lvl>
+    <w:lvl w:ilvl="5">
+      <w:start w:val="1"/>
+      <w:numFmt w:val="bullet"/>
+      <w:lvlText w:val=""/>
+      <w:lvlJc w:val="left"/>
+      <w:pPr>
+        <w:ind w:left="0" w:firstLine="0"/>
+      </w:pPr>
+      <w:rPr/>
+    </w:lvl>
+    <w:lvl w:ilvl="6">
+      <w:start w:val="1"/>
+      <w:numFmt w:val="bullet"/>
+      <w:lvlText w:val=""/>
+      <w:lvlJc w:val="left"/>
+      <w:pPr>
+        <w:ind w:left="0" w:firstLine="0"/>
+      </w:pPr>
+      <w:rPr/>
+    </w:lvl>
+    <w:lvl w:ilvl="7">
+      <w:start w:val="1"/>
+      <w:numFmt w:val="bullet"/>
+      <w:lvlText w:val=""/>
+      <w:lvlJc w:val="left"/>
+      <w:pPr>
+        <w:ind w:left="0" w:firstLine="0"/>
+      </w:pPr>
+      <w:rPr/>
+    </w:lvl>
+    <w:lvl w:ilvl="8">
+      <w:start w:val="1"/>
+      <w:numFmt w:val="bullet"/>
+      <w:lvlText w:val=""/>
+      <w:lvlJc w:val="left"/>
+      <w:pPr>
+        <w:ind w:left="0" w:firstLine="0"/>
+      </w:pPr>
+      <w:rPr/>
+    </w:lvl>
+  </w:abstractNum>
+  <w:abstractNum w:abstractNumId="8">
+    <w:lvl w:ilvl="0">
+      <w:start w:val="1"/>
+      <w:numFmt w:val="bullet"/>
+      <w:lvlText w:val="●"/>
+      <w:lvlJc w:val="left"/>
+      <w:pPr>
+        <w:ind w:left="720" w:hanging="360"/>
+      </w:pPr>
+      <w:rPr>
         <w:u w:val="none"/>
       </w:rPr>
     </w:lvl>
@@ -17985,7 +18707,7 @@
       </w:rPr>
     </w:lvl>
   </w:abstractNum>
-  <w:abstractNum w:abstractNumId="3">
+  <w:abstractNum w:abstractNumId="9">
     <w:lvl w:ilvl="0">
       <w:start w:val="1"/>
       <w:numFmt w:val="bullet"/>
@@ -18095,7 +18817,7 @@
       </w:rPr>
     </w:lvl>
   </w:abstractNum>
-  <w:abstractNum w:abstractNumId="4">
+  <w:abstractNum w:abstractNumId="10">
     <w:lvl w:ilvl="0">
       <w:start w:val="1"/>
       <w:numFmt w:val="decimal"/>
@@ -18187,7 +18909,7 @@
       <w:rPr/>
     </w:lvl>
   </w:abstractNum>
-  <w:abstractNum w:abstractNumId="5">
+  <w:abstractNum w:abstractNumId="11">
     <w:lvl w:ilvl="0">
       <w:start w:val="1"/>
       <w:numFmt w:val="bullet"/>
@@ -18281,7 +19003,7 @@
       <w:rPr/>
     </w:lvl>
   </w:abstractNum>
-  <w:abstractNum w:abstractNumId="6">
+  <w:abstractNum w:abstractNumId="12">
     <w:lvl w:ilvl="0">
       <w:start w:val="1"/>
       <w:numFmt w:val="bullet"/>
@@ -18375,7 +19097,7 @@
       <w:rPr/>
     </w:lvl>
   </w:abstractNum>
-  <w:abstractNum w:abstractNumId="7">
+  <w:abstractNum w:abstractNumId="13">
     <w:lvl w:ilvl="0">
       <w:start w:val="1"/>
       <w:numFmt w:val="bullet"/>
@@ -18387,568 +19109,6 @@
       <w:rPr>
         <w:rFonts w:ascii="Noto Sans Symbols" w:cs="Noto Sans Symbols" w:eastAsia="Noto Sans Symbols" w:hAnsi="Noto Sans Symbols"/>
       </w:rPr>
-    </w:lvl>
-    <w:lvl w:ilvl="1">
-      <w:start w:val="1"/>
-      <w:numFmt w:val="bullet"/>
-      <w:lvlText w:val=""/>
-      <w:lvlJc w:val="left"/>
-      <w:pPr>
-        <w:ind w:left="0" w:firstLine="0"/>
-      </w:pPr>
-      <w:rPr/>
-    </w:lvl>
-    <w:lvl w:ilvl="2">
-      <w:start w:val="1"/>
-      <w:numFmt w:val="bullet"/>
-      <w:lvlText w:val=""/>
-      <w:lvlJc w:val="left"/>
-      <w:pPr>
-        <w:ind w:left="0" w:firstLine="0"/>
-      </w:pPr>
-      <w:rPr/>
-    </w:lvl>
-    <w:lvl w:ilvl="3">
-      <w:start w:val="1"/>
-      <w:numFmt w:val="bullet"/>
-      <w:lvlText w:val=""/>
-      <w:lvlJc w:val="left"/>
-      <w:pPr>
-        <w:ind w:left="0" w:firstLine="0"/>
-      </w:pPr>
-      <w:rPr/>
-    </w:lvl>
-    <w:lvl w:ilvl="4">
-      <w:start w:val="1"/>
-      <w:numFmt w:val="bullet"/>
-      <w:lvlText w:val=""/>
-      <w:lvlJc w:val="left"/>
-      <w:pPr>
-        <w:ind w:left="0" w:firstLine="0"/>
-      </w:pPr>
-      <w:rPr/>
-    </w:lvl>
-    <w:lvl w:ilvl="5">
-      <w:start w:val="1"/>
-      <w:numFmt w:val="bullet"/>
-      <w:lvlText w:val=""/>
-      <w:lvlJc w:val="left"/>
-      <w:pPr>
-        <w:ind w:left="0" w:firstLine="0"/>
-      </w:pPr>
-      <w:rPr/>
-    </w:lvl>
-    <w:lvl w:ilvl="6">
-      <w:start w:val="1"/>
-      <w:numFmt w:val="bullet"/>
-      <w:lvlText w:val=""/>
-      <w:lvlJc w:val="left"/>
-      <w:pPr>
-        <w:ind w:left="0" w:firstLine="0"/>
-      </w:pPr>
-      <w:rPr/>
-    </w:lvl>
-    <w:lvl w:ilvl="7">
-      <w:start w:val="1"/>
-      <w:numFmt w:val="bullet"/>
-      <w:lvlText w:val=""/>
-      <w:lvlJc w:val="left"/>
-      <w:pPr>
-        <w:ind w:left="0" w:firstLine="0"/>
-      </w:pPr>
-      <w:rPr/>
-    </w:lvl>
-    <w:lvl w:ilvl="8">
-      <w:start w:val="1"/>
-      <w:numFmt w:val="bullet"/>
-      <w:lvlText w:val=""/>
-      <w:lvlJc w:val="left"/>
-      <w:pPr>
-        <w:ind w:left="0" w:firstLine="0"/>
-      </w:pPr>
-      <w:rPr/>
-    </w:lvl>
-  </w:abstractNum>
-  <w:abstractNum w:abstractNumId="8">
-    <w:lvl w:ilvl="0">
-      <w:start w:val="1"/>
-      <w:numFmt w:val="bullet"/>
-      <w:lvlText w:val="●"/>
-      <w:lvlJc w:val="left"/>
-      <w:pPr>
-        <w:ind w:left="720" w:hanging="360"/>
-      </w:pPr>
-      <w:rPr>
-        <w:rFonts w:ascii="Noto Sans Symbols" w:cs="Noto Sans Symbols" w:eastAsia="Noto Sans Symbols" w:hAnsi="Noto Sans Symbols"/>
-      </w:rPr>
-    </w:lvl>
-    <w:lvl w:ilvl="1">
-      <w:start w:val="1"/>
-      <w:numFmt w:val="bullet"/>
-      <w:lvlText w:val=""/>
-      <w:lvlJc w:val="left"/>
-      <w:pPr>
-        <w:ind w:left="0" w:firstLine="0"/>
-      </w:pPr>
-      <w:rPr/>
-    </w:lvl>
-    <w:lvl w:ilvl="2">
-      <w:start w:val="1"/>
-      <w:numFmt w:val="bullet"/>
-      <w:lvlText w:val=""/>
-      <w:lvlJc w:val="left"/>
-      <w:pPr>
-        <w:ind w:left="0" w:firstLine="0"/>
-      </w:pPr>
-      <w:rPr/>
-    </w:lvl>
-    <w:lvl w:ilvl="3">
-      <w:start w:val="1"/>
-      <w:numFmt w:val="bullet"/>
-      <w:lvlText w:val=""/>
-      <w:lvlJc w:val="left"/>
-      <w:pPr>
-        <w:ind w:left="0" w:firstLine="0"/>
-      </w:pPr>
-      <w:rPr/>
-    </w:lvl>
-    <w:lvl w:ilvl="4">
-      <w:start w:val="1"/>
-      <w:numFmt w:val="bullet"/>
-      <w:lvlText w:val=""/>
-      <w:lvlJc w:val="left"/>
-      <w:pPr>
-        <w:ind w:left="0" w:firstLine="0"/>
-      </w:pPr>
-      <w:rPr/>
-    </w:lvl>
-    <w:lvl w:ilvl="5">
-      <w:start w:val="1"/>
-      <w:numFmt w:val="bullet"/>
-      <w:lvlText w:val=""/>
-      <w:lvlJc w:val="left"/>
-      <w:pPr>
-        <w:ind w:left="0" w:firstLine="0"/>
-      </w:pPr>
-      <w:rPr/>
-    </w:lvl>
-    <w:lvl w:ilvl="6">
-      <w:start w:val="1"/>
-      <w:numFmt w:val="bullet"/>
-      <w:lvlText w:val=""/>
-      <w:lvlJc w:val="left"/>
-      <w:pPr>
-        <w:ind w:left="0" w:firstLine="0"/>
-      </w:pPr>
-      <w:rPr/>
-    </w:lvl>
-    <w:lvl w:ilvl="7">
-      <w:start w:val="1"/>
-      <w:numFmt w:val="bullet"/>
-      <w:lvlText w:val=""/>
-      <w:lvlJc w:val="left"/>
-      <w:pPr>
-        <w:ind w:left="0" w:firstLine="0"/>
-      </w:pPr>
-      <w:rPr/>
-    </w:lvl>
-    <w:lvl w:ilvl="8">
-      <w:start w:val="1"/>
-      <w:numFmt w:val="bullet"/>
-      <w:lvlText w:val=""/>
-      <w:lvlJc w:val="left"/>
-      <w:pPr>
-        <w:ind w:left="0" w:firstLine="0"/>
-      </w:pPr>
-      <w:rPr/>
-    </w:lvl>
-  </w:abstractNum>
-  <w:abstractNum w:abstractNumId="9">
-    <w:lvl w:ilvl="0">
-      <w:start w:val="1"/>
-      <w:numFmt w:val="bullet"/>
-      <w:lvlText w:val="●"/>
-      <w:lvlJc w:val="left"/>
-      <w:pPr>
-        <w:ind w:left="720" w:hanging="360"/>
-      </w:pPr>
-      <w:rPr>
-        <w:rFonts w:ascii="Noto Sans Symbols" w:cs="Noto Sans Symbols" w:eastAsia="Noto Sans Symbols" w:hAnsi="Noto Sans Symbols"/>
-      </w:rPr>
-    </w:lvl>
-    <w:lvl w:ilvl="1">
-      <w:start w:val="1"/>
-      <w:numFmt w:val="bullet"/>
-      <w:lvlText w:val=""/>
-      <w:lvlJc w:val="left"/>
-      <w:pPr>
-        <w:ind w:left="0" w:firstLine="0"/>
-      </w:pPr>
-      <w:rPr/>
-    </w:lvl>
-    <w:lvl w:ilvl="2">
-      <w:start w:val="1"/>
-      <w:numFmt w:val="bullet"/>
-      <w:lvlText w:val=""/>
-      <w:lvlJc w:val="left"/>
-      <w:pPr>
-        <w:ind w:left="0" w:firstLine="0"/>
-      </w:pPr>
-      <w:rPr/>
-    </w:lvl>
-    <w:lvl w:ilvl="3">
-      <w:start w:val="1"/>
-      <w:numFmt w:val="bullet"/>
-      <w:lvlText w:val=""/>
-      <w:lvlJc w:val="left"/>
-      <w:pPr>
-        <w:ind w:left="0" w:firstLine="0"/>
-      </w:pPr>
-      <w:rPr/>
-    </w:lvl>
-    <w:lvl w:ilvl="4">
-      <w:start w:val="1"/>
-      <w:numFmt w:val="bullet"/>
-      <w:lvlText w:val=""/>
-      <w:lvlJc w:val="left"/>
-      <w:pPr>
-        <w:ind w:left="0" w:firstLine="0"/>
-      </w:pPr>
-      <w:rPr/>
-    </w:lvl>
-    <w:lvl w:ilvl="5">
-      <w:start w:val="1"/>
-      <w:numFmt w:val="bullet"/>
-      <w:lvlText w:val=""/>
-      <w:lvlJc w:val="left"/>
-      <w:pPr>
-        <w:ind w:left="0" w:firstLine="0"/>
-      </w:pPr>
-      <w:rPr/>
-    </w:lvl>
-    <w:lvl w:ilvl="6">
-      <w:start w:val="1"/>
-      <w:numFmt w:val="bullet"/>
-      <w:lvlText w:val=""/>
-      <w:lvlJc w:val="left"/>
-      <w:pPr>
-        <w:ind w:left="0" w:firstLine="0"/>
-      </w:pPr>
-      <w:rPr/>
-    </w:lvl>
-    <w:lvl w:ilvl="7">
-      <w:start w:val="1"/>
-      <w:numFmt w:val="bullet"/>
-      <w:lvlText w:val=""/>
-      <w:lvlJc w:val="left"/>
-      <w:pPr>
-        <w:ind w:left="0" w:firstLine="0"/>
-      </w:pPr>
-      <w:rPr/>
-    </w:lvl>
-    <w:lvl w:ilvl="8">
-      <w:start w:val="1"/>
-      <w:numFmt w:val="bullet"/>
-      <w:lvlText w:val=""/>
-      <w:lvlJc w:val="left"/>
-      <w:pPr>
-        <w:ind w:left="0" w:firstLine="0"/>
-      </w:pPr>
-      <w:rPr/>
-    </w:lvl>
-  </w:abstractNum>
-  <w:abstractNum w:abstractNumId="10">
-    <w:lvl w:ilvl="0">
-      <w:start w:val="1"/>
-      <w:numFmt w:val="bullet"/>
-      <w:lvlText w:val="●"/>
-      <w:lvlJc w:val="left"/>
-      <w:pPr>
-        <w:ind w:left="720" w:hanging="360"/>
-      </w:pPr>
-      <w:rPr>
-        <w:rFonts w:ascii="Noto Sans Symbols" w:cs="Noto Sans Symbols" w:eastAsia="Noto Sans Symbols" w:hAnsi="Noto Sans Symbols"/>
-      </w:rPr>
-    </w:lvl>
-    <w:lvl w:ilvl="1">
-      <w:start w:val="1"/>
-      <w:numFmt w:val="bullet"/>
-      <w:lvlText w:val=""/>
-      <w:lvlJc w:val="left"/>
-      <w:pPr>
-        <w:ind w:left="0" w:firstLine="0"/>
-      </w:pPr>
-      <w:rPr/>
-    </w:lvl>
-    <w:lvl w:ilvl="2">
-      <w:start w:val="1"/>
-      <w:numFmt w:val="bullet"/>
-      <w:lvlText w:val=""/>
-      <w:lvlJc w:val="left"/>
-      <w:pPr>
-        <w:ind w:left="0" w:firstLine="0"/>
-      </w:pPr>
-      <w:rPr/>
-    </w:lvl>
-    <w:lvl w:ilvl="3">
-      <w:start w:val="1"/>
-      <w:numFmt w:val="bullet"/>
-      <w:lvlText w:val=""/>
-      <w:lvlJc w:val="left"/>
-      <w:pPr>
-        <w:ind w:left="0" w:firstLine="0"/>
-      </w:pPr>
-      <w:rPr/>
-    </w:lvl>
-    <w:lvl w:ilvl="4">
-      <w:start w:val="1"/>
-      <w:numFmt w:val="bullet"/>
-      <w:lvlText w:val=""/>
-      <w:lvlJc w:val="left"/>
-      <w:pPr>
-        <w:ind w:left="0" w:firstLine="0"/>
-      </w:pPr>
-      <w:rPr/>
-    </w:lvl>
-    <w:lvl w:ilvl="5">
-      <w:start w:val="1"/>
-      <w:numFmt w:val="bullet"/>
-      <w:lvlText w:val=""/>
-      <w:lvlJc w:val="left"/>
-      <w:pPr>
-        <w:ind w:left="0" w:firstLine="0"/>
-      </w:pPr>
-      <w:rPr/>
-    </w:lvl>
-    <w:lvl w:ilvl="6">
-      <w:start w:val="1"/>
-      <w:numFmt w:val="bullet"/>
-      <w:lvlText w:val=""/>
-      <w:lvlJc w:val="left"/>
-      <w:pPr>
-        <w:ind w:left="0" w:firstLine="0"/>
-      </w:pPr>
-      <w:rPr/>
-    </w:lvl>
-    <w:lvl w:ilvl="7">
-      <w:start w:val="1"/>
-      <w:numFmt w:val="bullet"/>
-      <w:lvlText w:val=""/>
-      <w:lvlJc w:val="left"/>
-      <w:pPr>
-        <w:ind w:left="0" w:firstLine="0"/>
-      </w:pPr>
-      <w:rPr/>
-    </w:lvl>
-    <w:lvl w:ilvl="8">
-      <w:start w:val="1"/>
-      <w:numFmt w:val="bullet"/>
-      <w:lvlText w:val=""/>
-      <w:lvlJc w:val="left"/>
-      <w:pPr>
-        <w:ind w:left="0" w:firstLine="0"/>
-      </w:pPr>
-      <w:rPr/>
-    </w:lvl>
-  </w:abstractNum>
-  <w:abstractNum w:abstractNumId="11">
-    <w:lvl w:ilvl="0">
-      <w:start w:val="1"/>
-      <w:numFmt w:val="bullet"/>
-      <w:lvlText w:val="●"/>
-      <w:lvlJc w:val="left"/>
-      <w:pPr>
-        <w:ind w:left="720" w:hanging="360"/>
-      </w:pPr>
-      <w:rPr>
-        <w:rFonts w:ascii="Noto Sans Symbols" w:cs="Noto Sans Symbols" w:eastAsia="Noto Sans Symbols" w:hAnsi="Noto Sans Symbols"/>
-      </w:rPr>
-    </w:lvl>
-    <w:lvl w:ilvl="1">
-      <w:start w:val="1"/>
-      <w:numFmt w:val="bullet"/>
-      <w:lvlText w:val=""/>
-      <w:lvlJc w:val="left"/>
-      <w:pPr>
-        <w:ind w:left="0" w:firstLine="0"/>
-      </w:pPr>
-      <w:rPr/>
-    </w:lvl>
-    <w:lvl w:ilvl="2">
-      <w:start w:val="1"/>
-      <w:numFmt w:val="bullet"/>
-      <w:lvlText w:val=""/>
-      <w:lvlJc w:val="left"/>
-      <w:pPr>
-        <w:ind w:left="0" w:firstLine="0"/>
-      </w:pPr>
-      <w:rPr/>
-    </w:lvl>
-    <w:lvl w:ilvl="3">
-      <w:start w:val="1"/>
-      <w:numFmt w:val="bullet"/>
-      <w:lvlText w:val=""/>
-      <w:lvlJc w:val="left"/>
-      <w:pPr>
-        <w:ind w:left="0" w:firstLine="0"/>
-      </w:pPr>
-      <w:rPr/>
-    </w:lvl>
-    <w:lvl w:ilvl="4">
-      <w:start w:val="1"/>
-      <w:numFmt w:val="bullet"/>
-      <w:lvlText w:val=""/>
-      <w:lvlJc w:val="left"/>
-      <w:pPr>
-        <w:ind w:left="0" w:firstLine="0"/>
-      </w:pPr>
-      <w:rPr/>
-    </w:lvl>
-    <w:lvl w:ilvl="5">
-      <w:start w:val="1"/>
-      <w:numFmt w:val="bullet"/>
-      <w:lvlText w:val=""/>
-      <w:lvlJc w:val="left"/>
-      <w:pPr>
-        <w:ind w:left="0" w:firstLine="0"/>
-      </w:pPr>
-      <w:rPr/>
-    </w:lvl>
-    <w:lvl w:ilvl="6">
-      <w:start w:val="1"/>
-      <w:numFmt w:val="bullet"/>
-      <w:lvlText w:val=""/>
-      <w:lvlJc w:val="left"/>
-      <w:pPr>
-        <w:ind w:left="0" w:firstLine="0"/>
-      </w:pPr>
-      <w:rPr/>
-    </w:lvl>
-    <w:lvl w:ilvl="7">
-      <w:start w:val="1"/>
-      <w:numFmt w:val="bullet"/>
-      <w:lvlText w:val=""/>
-      <w:lvlJc w:val="left"/>
-      <w:pPr>
-        <w:ind w:left="0" w:firstLine="0"/>
-      </w:pPr>
-      <w:rPr/>
-    </w:lvl>
-    <w:lvl w:ilvl="8">
-      <w:start w:val="1"/>
-      <w:numFmt w:val="bullet"/>
-      <w:lvlText w:val=""/>
-      <w:lvlJc w:val="left"/>
-      <w:pPr>
-        <w:ind w:left="0" w:firstLine="0"/>
-      </w:pPr>
-      <w:rPr/>
-    </w:lvl>
-  </w:abstractNum>
-  <w:abstractNum w:abstractNumId="12">
-    <w:lvl w:ilvl="0">
-      <w:start w:val="1"/>
-      <w:numFmt w:val="bullet"/>
-      <w:lvlText w:val="●"/>
-      <w:lvlJc w:val="left"/>
-      <w:pPr>
-        <w:ind w:left="720" w:hanging="360"/>
-      </w:pPr>
-      <w:rPr>
-        <w:rFonts w:ascii="Noto Sans Symbols" w:cs="Noto Sans Symbols" w:eastAsia="Noto Sans Symbols" w:hAnsi="Noto Sans Symbols"/>
-      </w:rPr>
-    </w:lvl>
-    <w:lvl w:ilvl="1">
-      <w:start w:val="1"/>
-      <w:numFmt w:val="bullet"/>
-      <w:lvlText w:val=""/>
-      <w:lvlJc w:val="left"/>
-      <w:pPr>
-        <w:ind w:left="0" w:firstLine="0"/>
-      </w:pPr>
-      <w:rPr/>
-    </w:lvl>
-    <w:lvl w:ilvl="2">
-      <w:start w:val="1"/>
-      <w:numFmt w:val="bullet"/>
-      <w:lvlText w:val=""/>
-      <w:lvlJc w:val="left"/>
-      <w:pPr>
-        <w:ind w:left="0" w:firstLine="0"/>
-      </w:pPr>
-      <w:rPr/>
-    </w:lvl>
-    <w:lvl w:ilvl="3">
-      <w:start w:val="1"/>
-      <w:numFmt w:val="bullet"/>
-      <w:lvlText w:val=""/>
-      <w:lvlJc w:val="left"/>
-      <w:pPr>
-        <w:ind w:left="0" w:firstLine="0"/>
-      </w:pPr>
-      <w:rPr/>
-    </w:lvl>
-    <w:lvl w:ilvl="4">
-      <w:start w:val="1"/>
-      <w:numFmt w:val="bullet"/>
-      <w:lvlText w:val=""/>
-      <w:lvlJc w:val="left"/>
-      <w:pPr>
-        <w:ind w:left="0" w:firstLine="0"/>
-      </w:pPr>
-      <w:rPr/>
-    </w:lvl>
-    <w:lvl w:ilvl="5">
-      <w:start w:val="1"/>
-      <w:numFmt w:val="bullet"/>
-      <w:lvlText w:val=""/>
-      <w:lvlJc w:val="left"/>
-      <w:pPr>
-        <w:ind w:left="0" w:firstLine="0"/>
-      </w:pPr>
-      <w:rPr/>
-    </w:lvl>
-    <w:lvl w:ilvl="6">
-      <w:start w:val="1"/>
-      <w:numFmt w:val="bullet"/>
-      <w:lvlText w:val=""/>
-      <w:lvlJc w:val="left"/>
-      <w:pPr>
-        <w:ind w:left="0" w:firstLine="0"/>
-      </w:pPr>
-      <w:rPr/>
-    </w:lvl>
-    <w:lvl w:ilvl="7">
-      <w:start w:val="1"/>
-      <w:numFmt w:val="bullet"/>
-      <w:lvlText w:val=""/>
-      <w:lvlJc w:val="left"/>
-      <w:pPr>
-        <w:ind w:left="0" w:firstLine="0"/>
-      </w:pPr>
-      <w:rPr/>
-    </w:lvl>
-    <w:lvl w:ilvl="8">
-      <w:start w:val="1"/>
-      <w:numFmt w:val="bullet"/>
-      <w:lvlText w:val=""/>
-      <w:lvlJc w:val="left"/>
-      <w:pPr>
-        <w:ind w:left="0" w:firstLine="0"/>
-      </w:pPr>
-      <w:rPr/>
-    </w:lvl>
-  </w:abstractNum>
-  <w:abstractNum w:abstractNumId="13">
-    <w:lvl w:ilvl="0">
-      <w:start w:val="1"/>
-      <w:numFmt w:val="decimal"/>
-      <w:lvlText w:val="%1."/>
-      <w:lvlJc w:val="left"/>
-      <w:pPr>
-        <w:ind w:left="720" w:hanging="360"/>
-      </w:pPr>
-      <w:rPr/>
     </w:lvl>
     <w:lvl w:ilvl="1">
       <w:start w:val="1"/>

</xml_diff>